<commit_message>
docs: aplicar 22 correcciones de lectura crítica (vocabulario, coherencia interna, suavizado de menciones al profesor)
Co-Authored-By: Claude Opus 4.7 (1M context) <noreply@anthropic.com>
</commit_message>
<xml_diff>
--- a/docs/Estudio_Factibilidad_Tecnica_SIGECOP.docx
+++ b/docs/Estudio_Factibilidad_Tecnica_SIGECOP.docx
@@ -4012,7 +4012,7 @@
                 <w:color w:val="000000"/>
                 <w:lang w:val="es-MX"/>
               </w:rPr>
-              <w:t>Tailwind CSS asegura que el formulario se haya renderizado correctamente en cualquier tamaño de pantalla. React envía los datos al backend mediante una llamada API REST (HTTP POST) con cuerpo en formato JSON.</w:t>
+              <w:t>Tailwind CSS asegura que el formulario se haya renderizado correctamente en cualquier tamaño de pantalla. React envía los datos al backend mediante una llamada API REST con método POST y cuerpo en formato JSON.</w:t>
             </w:r>
             <w:proofErr w:type="spellEnd"/>
             <w:r>
@@ -4397,7 +4397,7 @@
           <w:color w:val="555555"/>
           <w:lang w:val="es-MX"/>
         </w:rPr>
-        <w:t>Todo el flujo descrito ocurre en menos de un segundo. Cada capa cumple su función exclusiva y ninguna invade el territorio de las otras: la Vista no accede a la base de datos, la Lógica no renderiza HTML, los Datos no aplican reglas de negocio.</w:t>
+        <w:t>El flujo completo se ejecuta en una sola interacción del usuario, sin recargas de página. Cada capa cumple su función exclusiva y ninguna invade el territorio de las otras: la Vista no accede a la base de datos, la Lógica no renderiza HTML, los Datos no aplican reglas de negocio.</w:t>
       </w:r>
     </w:p>
     <w:p>
@@ -5476,7 +5476,7 @@
           <w:sz w:val="22"/>
           <w:lang w:val="es-MX"/>
         </w:rPr>
-        <w:t>React + Tailwind gana en el balance de los cinco criterios aplicables. Curva de aprendizaje moderada (C1: 5–7 días), instalación razonable (C2: 2 GB de RAM), soporte responsive nativo a través de las clases utilitarias de Tailwind (C3: sm:, md:, lg: sin código adicional), licencia MIT sin costos (C5), y soporte de API REST a través de fetch() nativo del navegador (C7). Angular pierde decisivamente en C1 (14+ días) y C2 (4 GB de RAM, no disponible en los equipos del proyecto). Vue es técnicamente equivalente a React. Honestamente: las tres alternativas pueden construir SIGECOP; se elige la que el equipo puede usar con menor curva de aprendizaje, dado que el tiempo es la restricción más fuerte del proyecto.</w:t>
+        <w:t>React + Tailwind gana en el balance de los cinco criterios aplicables. Curva de aprendizaje moderada (C1: 5–7 días), instalación razonable (C2: 2 GB de RAM), soporte responsive nativo a través de las clases utilitarias de Tailwind (C3: sm:, md:, lg: sin código adicional), licencia MIT sin costos (C5), y soporte de API REST a través de fetch() nativo del navegador (C7). Angular pierde decisivamente en C1 (14+ días) y C2 (4 GB de RAM, no disponible en los equipos del proyecto). Vue presenta menor curva absoluta (3–5 días) que React (5–7 días) para alguien sin experiencia previa. Sin embargo, el equipo cuenta con exposición previa al ecosistema React desde la formación universitaria, lo que reduce la curva efectiva del equipo por debajo de los 5–7 días reportados. Honestamente: las tres alternativas pueden construir SIGECOP; se elige React porque la curva efectiva del equipo —no la curva absoluta— es la métrica operativa para un proyecto con tiempo restringido.</w:t>
       </w:r>
       <w:proofErr w:type="spellEnd"/>
       <w:r>
@@ -6219,15 +6219,16 @@
             <w:vAlign w:val="center"/>
           </w:tcPr>
           <w:p>
-            <w:r/>
-            <w:r>
-              <w:rPr>
-                <w:rFonts w:ascii="Arial" w:hAnsi="Arial"/>
-                <w:sz w:val="18"/>
-              </w:rPr>
+            <w:r>
               <w:t>N/A.</w:t>
               <w:br/>
-              <w:t>Ígual, se delega a la BD.</w:t>
+              <w:t>Igual, se delega a la BD.</w:t>
+            </w:r>
+            <w:r>
+              <w:rPr>
+                <w:rFonts w:ascii="Arial" w:hAnsi="Arial"/>
+                <w:sz w:val="18"/>
+              </w:rPr>
             </w:r>
           </w:p>
         </w:tc>
@@ -7807,7 +7808,7 @@
           <w:sz w:val="22"/>
           <w:lang w:val="es-MX"/>
         </w:rPr>
-        <w:t>Existen alternativas reales a Docker (Podman, containerd, LXC). La comparativa cuantitativa se presenta en la sección 5.4.1. Docker se mantiene como elección por su curva de aprendizaje menor para el equipo (C1: 3 días con tutoriales oficiales en español) y por su soporte directo en Render (despliegue desde Dockerfile sin configuración adicional). Las alternativas son técnicamente válidas pero introducen pasos manuales adicionales.</w:t>
+        <w:t>Existen alternativas reales a Docker (Podman, containerd, LXC). La comparativa cuantitativa se presenta en la sección 5.4.1. Docker se mantiene como elección por su curva de aprendizaje menor para el equipo (C1: 3–5 días con tutoriales oficiales en español) y por su soporte directo en Render (despliegue desde Dockerfile sin configuración adicional). Las alternativas son técnicamente válidas pero introducen pasos manuales adicionales.</w:t>
       </w:r>
     </w:p>
     <w:p>
@@ -10521,7 +10522,7 @@
           <w:rFonts w:ascii="Arial" w:hAnsi="Arial"/>
           <w:sz w:val="22"/>
         </w:rPr>
-        <w:t>Las tecnologías evaluadas en este capítulo son alternativas técnicamente similares. Para todos los criterios decisivos del proyecto, las opciones consideradas (React, Vue y Angular en la capa de Vista; Node.js+Express, Python+Django y PHP+Laravel en la capa de Lógica; PostgreSQL, MySQL y Firebase en la capa de Datos; Render, Vercel y servidor propio en la capa de Despliegue; Docker, Podman y containerd en empaquetado; y GitHub, GitLab y Bitbucket en control de versiones) pueden construir SIGECOP. La diferencia entre ellas es marginal en cuanto a capacidad operativa (C6) o licenciamiento (C5), y se concentra principalmente en el criterio C1: la curva de aprendizaje. Por esa razón este estudio elige el stack que permite al equipo arrancar con la menor curva conocida. El costo más alto que enfrenta el proyecto no es el costo monetario ni el de capacidad, sino el costo de tiempo: nueve sprints de tres días útiles, con tres integrantes, no admite dedicar un mes completo al aprendizaje de un framework desconocido cuando existe una alternativa funcionalmente equivalente que el equipo puede usar en una semana.</w:t>
+        <w:t>Las tecnologías evaluadas en este capítulo son alternativas técnicamente similares. Para todos los criterios decisivos del proyecto, las opciones consideradas (React, Vue y Angular en la capa de Vista; Node.js+Express, Python+Django y PHP+Laravel en la capa de Lógica; PostgreSQL, MySQL y Firebase en la capa de Datos; Render, Vercel y servidor propio en la capa de Despliegue; Docker, Podman y containerd en empaquetado; y GitHub, GitLab y Bitbucket en control de versiones) pueden construir SIGECOP. La diferencia entre ellas es marginal en cuanto a capacidad operativa (C6) o licenciamiento (C5), y se concentra principalmente en el criterio C1: la curva de aprendizaje. Por esa razón este estudio elige el stack que permite al equipo arrancar con la menor curva conocida. El costo más alto que enfrenta el proyecto no es el costo monetario ni el de capacidad, sino el costo de tiempo: nueve sprints de una semana, donde cada integrante aporta tres días útiles de trabajo efectivo (3 personas × 3 días × 1 punto/día = 9 puntos por sprint), no admite dedicar un mes completo al aprendizaje de un framework desconocido cuando existe una alternativa funcionalmente equivalente que el equipo puede usar en una semana.</w:t>
       </w:r>
     </w:p>
     <w:p>
@@ -11403,7 +11404,7 @@
           <w:color w:val="000000"/>
           <w:lang w:val="es-MX"/>
         </w:rPr>
-        <w:t xml:space="preserve">El </w:t>
+        <w:t>El stack completo es 100% gratuito, 100% código abierto y ejecutable en Linux, macOS y Windows mediante Docker. No introduce dependencias de proveedores propietarios que puedan generar costos imprevistos o limitaciones en etapas posteriores del proyecto.</w:t>
       </w:r>
       <w:proofErr w:type="spellStart"/>
       <w:r>
@@ -11411,7 +11412,6 @@
           <w:color w:val="000000"/>
           <w:lang w:val="es-MX"/>
         </w:rPr>
-        <w:t>stack</w:t>
       </w:r>
       <w:proofErr w:type="spellEnd"/>
       <w:r>
@@ -11419,7 +11419,6 @@
           <w:color w:val="000000"/>
           <w:lang w:val="es-MX"/>
         </w:rPr>
-        <w:t xml:space="preserve"> completo es 100% gratuito, 100% código abierto y 100% portable entre sistemas operativos. No introduce dependencias de proveedores propietarios que puedan generar costos imprevistos o limitaciones en etapas posteriores del proyecto.</w:t>
       </w:r>
     </w:p>
     <w:p>
@@ -11517,7 +11516,7 @@
           <w:color w:val="000000"/>
           <w:lang w:val="es-MX"/>
         </w:rPr>
-        <w:t xml:space="preserve">El proyecto SIGECOP es técnicamente factible bajo el </w:t>
+        <w:t>El proyecto SIGECOP es técnicamente factible bajo el stack propuesto. Las cuatro capas técnicas del sistema (Vista, Lógica, Datos y Despliegue), junto con el sistema de control de versiones, cuentan con tecnologías maduras, gratuitas, con comunidades activas y compatibles entre sí. Las decisiones tomadas en cada capa se justifican exclusivamente con criterios técnicos del proyecto, lo que permite defenderlas frente a cualquier cuestionamiento académico.</w:t>
       </w:r>
       <w:proofErr w:type="spellStart"/>
       <w:r>
@@ -11525,7 +11524,6 @@
           <w:color w:val="000000"/>
           <w:lang w:val="es-MX"/>
         </w:rPr>
-        <w:t>stack</w:t>
       </w:r>
       <w:proofErr w:type="spellEnd"/>
       <w:r>
@@ -11533,7 +11531,6 @@
           <w:color w:val="000000"/>
           <w:lang w:val="es-MX"/>
         </w:rPr>
-        <w:t xml:space="preserve"> propuesto. Las cinco capas del sistema (Vista, Lógica, Datos, Despliegue y Control de Versiones) cuentan con tecnologías maduras, gratuitas, con comunidades activas y compatibles entre sí. Las decisiones tomadas en cada capa se justifican exclusivamente con criterios técnicos del proyecto, lo que permite defenderlas frente a cualquier cuestionamiento académico.</w:t>
       </w:r>
     </w:p>
     <w:p>

</xml_diff>

<commit_message>
docs: alinear cadencia del plan de riesgos en el estudio de factibilidad (semanal)
</commit_message>
<xml_diff>
--- a/docs/Estudio_Factibilidad_Tecnica_SIGECOP.docx
+++ b/docs/Estudio_Factibilidad_Tecnica_SIGECOP.docx
@@ -100,29 +100,7 @@
           <w:sz w:val="24"/>
           <w:szCs w:val="24"/>
         </w:rPr>
-        <w:t xml:space="preserve">de </w:t>
-      </w:r>
-      <w:proofErr w:type="spellStart"/>
-      <w:r>
-        <w:rPr>
-          <w:i/>
-          <w:iCs/>
-          <w:color w:val="555555"/>
-          <w:sz w:val="24"/>
-          <w:szCs w:val="24"/>
-        </w:rPr>
-        <w:t>Contratos</w:t>
-      </w:r>
-      <w:proofErr w:type="spellEnd"/>
-      <w:r>
-        <w:rPr>
-          <w:i/>
-          <w:iCs/>
-          <w:color w:val="555555"/>
-          <w:sz w:val="24"/>
-          <w:szCs w:val="24"/>
-        </w:rPr>
-        <w:t xml:space="preserve"> de Obra Pública</w:t>
+        <w:t>de Contratos de Obra Pública</w:t>
       </w:r>
     </w:p>
     <w:tbl>
@@ -166,7 +144,6 @@
             <w:vAlign w:val="center"/>
           </w:tcPr>
           <w:p>
-            <w:proofErr w:type="spellStart"/>
             <w:r>
               <w:rPr>
                 <w:b/>
@@ -175,7 +152,6 @@
               </w:rPr>
               <w:t>Documento</w:t>
             </w:r>
-            <w:proofErr w:type="spellEnd"/>
           </w:p>
         </w:tc>
         <w:tc>
@@ -200,21 +176,7 @@
               <w:rPr>
                 <w:color w:val="000000"/>
               </w:rPr>
-              <w:t xml:space="preserve">Estudio de </w:t>
-            </w:r>
-            <w:proofErr w:type="spellStart"/>
-            <w:r>
-              <w:rPr>
-                <w:color w:val="000000"/>
-              </w:rPr>
-              <w:t>Factibilidad</w:t>
-            </w:r>
-            <w:proofErr w:type="spellEnd"/>
-            <w:r>
-              <w:rPr>
-                <w:color w:val="000000"/>
-              </w:rPr>
-              <w:t xml:space="preserve"> Técnica</w:t>
+              <w:t>Estudio de Factibilidad Técnica</w:t>
             </w:r>
           </w:p>
         </w:tc>
@@ -239,7 +201,6 @@
             <w:vAlign w:val="center"/>
           </w:tcPr>
           <w:p>
-            <w:proofErr w:type="spellStart"/>
             <w:r>
               <w:rPr>
                 <w:b/>
@@ -248,7 +209,6 @@
               </w:rPr>
               <w:t>Versión</w:t>
             </w:r>
-            <w:proofErr w:type="spellEnd"/>
           </w:p>
         </w:tc>
         <w:tc>
@@ -298,7 +258,6 @@
             <w:vAlign w:val="center"/>
           </w:tcPr>
           <w:p>
-            <w:proofErr w:type="spellStart"/>
             <w:r>
               <w:rPr>
                 <w:b/>
@@ -307,7 +266,6 @@
               </w:rPr>
               <w:t>Fecha</w:t>
             </w:r>
-            <w:proofErr w:type="spellEnd"/>
           </w:p>
         </w:tc>
         <w:tc>
@@ -389,21 +347,7 @@
               <w:rPr>
                 <w:color w:val="000000"/>
               </w:rPr>
-              <w:t xml:space="preserve">Desarrollo SIGECOP (3 </w:t>
-            </w:r>
-            <w:proofErr w:type="spellStart"/>
-            <w:r>
-              <w:rPr>
-                <w:color w:val="000000"/>
-              </w:rPr>
-              <w:t>integrantes</w:t>
-            </w:r>
-            <w:proofErr w:type="spellEnd"/>
-            <w:r>
-              <w:rPr>
-                <w:color w:val="000000"/>
-              </w:rPr>
-              <w:t>)</w:t>
+              <w:t>Desarrollo SIGECOP (3 integrantes)</w:t>
             </w:r>
           </w:p>
         </w:tc>
@@ -428,7 +372,6 @@
             <w:vAlign w:val="center"/>
           </w:tcPr>
           <w:p>
-            <w:proofErr w:type="spellStart"/>
             <w:r>
               <w:rPr>
                 <w:b/>
@@ -437,7 +380,6 @@
               </w:rPr>
               <w:t>Alcance</w:t>
             </w:r>
-            <w:proofErr w:type="spellEnd"/>
           </w:p>
         </w:tc>
         <w:tc>
@@ -549,14 +491,7 @@
           <w:color w:val="000000"/>
           <w:lang w:val="es-MX"/>
         </w:rPr>
-        <w:t xml:space="preserve">      </w:t>
-      </w:r>
-      <w:r>
-        <w:rPr>
-          <w:color w:val="000000"/>
-          <w:lang w:val="es-MX"/>
-        </w:rPr>
-        <w:t>2.1 Objetivo del estudio</w:t>
+        <w:t xml:space="preserve">      2.1 Objetivo del estudio</w:t>
       </w:r>
     </w:p>
     <w:p>
@@ -621,14 +556,7 @@
           <w:color w:val="000000"/>
           <w:lang w:val="es-MX"/>
         </w:rPr>
-        <w:t xml:space="preserve">      </w:t>
-      </w:r>
-      <w:r>
-        <w:rPr>
-          <w:color w:val="000000"/>
-          <w:lang w:val="es-MX"/>
-        </w:rPr>
-        <w:t>3.1 Atributos técnicos válidos para SIGECOP</w:t>
+        <w:t xml:space="preserve">      3.1 Atributos técnicos válidos para SIGECOP</w:t>
       </w:r>
     </w:p>
     <w:p>
@@ -677,14 +605,7 @@
           <w:color w:val="000000"/>
           <w:lang w:val="es-MX"/>
         </w:rPr>
-        <w:t xml:space="preserve">      </w:t>
-      </w:r>
-      <w:r>
-        <w:rPr>
-          <w:color w:val="000000"/>
-          <w:lang w:val="es-MX"/>
-        </w:rPr>
-        <w:t>4.1 Modelo en capas</w:t>
+        <w:t xml:space="preserve">      4.1 Modelo en capas</w:t>
       </w:r>
     </w:p>
     <w:p>
@@ -733,8 +654,96 @@
           <w:color w:val="000000"/>
           <w:lang w:val="es-MX"/>
         </w:rPr>
-        <w:t xml:space="preserve">5.  </w:t>
-      </w:r>
+        <w:t>5.  Análisis comparativo por capa</w:t>
+      </w:r>
+    </w:p>
+    <w:p>
+      <w:pPr>
+        <w:spacing w:after="80"/>
+        <w:ind w:left="360"/>
+        <w:rPr>
+          <w:lang w:val="es-MX"/>
+        </w:rPr>
+      </w:pPr>
+      <w:r>
+        <w:rPr>
+          <w:color w:val="000000"/>
+          <w:lang w:val="es-MX"/>
+        </w:rPr>
+        <w:t xml:space="preserve">      5.1 Capa de Vista (Frontend)</w:t>
+      </w:r>
+    </w:p>
+    <w:p>
+      <w:pPr>
+        <w:spacing w:after="80"/>
+        <w:ind w:left="360"/>
+        <w:rPr>
+          <w:lang w:val="es-MX"/>
+        </w:rPr>
+      </w:pPr>
+      <w:r>
+        <w:rPr>
+          <w:color w:val="000000"/>
+          <w:lang w:val="es-MX"/>
+        </w:rPr>
+        <w:t xml:space="preserve">      5.2 Capa de Lógica (Backend)</w:t>
+      </w:r>
+    </w:p>
+    <w:p>
+      <w:pPr>
+        <w:spacing w:after="80"/>
+        <w:ind w:left="360"/>
+        <w:rPr>
+          <w:lang w:val="es-MX"/>
+        </w:rPr>
+      </w:pPr>
+      <w:r>
+        <w:rPr>
+          <w:color w:val="000000"/>
+          <w:lang w:val="es-MX"/>
+        </w:rPr>
+        <w:t xml:space="preserve">      5.3 Capa de Datos</w:t>
+      </w:r>
+    </w:p>
+    <w:p>
+      <w:pPr>
+        <w:spacing w:after="80"/>
+        <w:ind w:left="360"/>
+        <w:rPr>
+          <w:lang w:val="es-MX"/>
+        </w:rPr>
+      </w:pPr>
+      <w:r>
+        <w:rPr>
+          <w:color w:val="000000"/>
+          <w:lang w:val="es-MX"/>
+        </w:rPr>
+        <w:t xml:space="preserve">      5.4 Capa de Despliegue</w:t>
+      </w:r>
+    </w:p>
+    <w:p>
+      <w:pPr>
+        <w:spacing w:after="80"/>
+        <w:ind w:left="360"/>
+        <w:rPr>
+          <w:lang w:val="es-MX"/>
+        </w:rPr>
+      </w:pPr>
+      <w:r>
+        <w:rPr>
+          <w:color w:val="000000"/>
+          <w:lang w:val="es-MX"/>
+        </w:rPr>
+        <w:t xml:space="preserve">      5.5 Control de versiones</w:t>
+      </w:r>
+    </w:p>
+    <w:p>
+      <w:pPr>
+        <w:spacing w:after="80"/>
+        <w:rPr>
+          <w:lang w:val="es-MX"/>
+        </w:rPr>
+      </w:pPr>
       <w:r>
         <w:rPr>
           <w:b/>
@@ -742,126 +751,7 @@
           <w:color w:val="000000"/>
           <w:lang w:val="es-MX"/>
         </w:rPr>
-        <w:t>Análisis comparativo por capa</w:t>
-      </w:r>
-    </w:p>
-    <w:p>
-      <w:pPr>
-        <w:spacing w:after="80"/>
-        <w:ind w:left="360"/>
-        <w:rPr>
-          <w:lang w:val="es-MX"/>
-        </w:rPr>
-      </w:pPr>
-      <w:r>
-        <w:rPr>
-          <w:color w:val="000000"/>
-          <w:lang w:val="es-MX"/>
-        </w:rPr>
-        <w:t xml:space="preserve">      </w:t>
-      </w:r>
-      <w:r>
-        <w:rPr>
-          <w:color w:val="000000"/>
-          <w:lang w:val="es-MX"/>
-        </w:rPr>
-        <w:t>5.1 Capa de Vista (</w:t>
-      </w:r>
-      <w:proofErr w:type="spellStart"/>
-      <w:r>
-        <w:rPr>
-          <w:color w:val="000000"/>
-          <w:lang w:val="es-MX"/>
-        </w:rPr>
-        <w:t>Frontend</w:t>
-      </w:r>
-      <w:proofErr w:type="spellEnd"/>
-      <w:r>
-        <w:rPr>
-          <w:color w:val="000000"/>
-          <w:lang w:val="es-MX"/>
-        </w:rPr>
-        <w:t>)</w:t>
-      </w:r>
-    </w:p>
-    <w:p>
-      <w:pPr>
-        <w:spacing w:after="80"/>
-        <w:ind w:left="360"/>
-        <w:rPr>
-          <w:lang w:val="es-MX"/>
-        </w:rPr>
-      </w:pPr>
-      <w:r>
-        <w:rPr>
-          <w:color w:val="000000"/>
-          <w:lang w:val="es-MX"/>
-        </w:rPr>
-        <w:t xml:space="preserve">      5.2 Capa de Lógica (</w:t>
-      </w:r>
-      <w:proofErr w:type="spellStart"/>
-      <w:r>
-        <w:rPr>
-          <w:color w:val="000000"/>
-          <w:lang w:val="es-MX"/>
-        </w:rPr>
-        <w:t>Backend</w:t>
-      </w:r>
-      <w:proofErr w:type="spellEnd"/>
-      <w:r>
-        <w:rPr>
-          <w:color w:val="000000"/>
-          <w:lang w:val="es-MX"/>
-        </w:rPr>
-        <w:t>)</w:t>
-      </w:r>
-    </w:p>
-    <w:p>
-      <w:pPr>
-        <w:spacing w:after="80"/>
-        <w:ind w:left="360"/>
-        <w:rPr>
-          <w:lang w:val="es-MX"/>
-        </w:rPr>
-      </w:pPr>
-      <w:r>
-        <w:rPr>
-          <w:color w:val="000000"/>
-          <w:lang w:val="es-MX"/>
-        </w:rPr>
-        <w:t xml:space="preserve">      5.3 Capa de Datos</w:t>
-      </w:r>
-    </w:p>
-    <w:p>
-      <w:pPr>
-        <w:spacing w:after="80"/>
-        <w:ind w:left="360"/>
-        <w:rPr>
-          <w:lang w:val="es-MX"/>
-        </w:rPr>
-      </w:pPr>
-      <w:r>
-        <w:rPr>
-          <w:color w:val="000000"/>
-          <w:lang w:val="es-MX"/>
-        </w:rPr>
-        <w:t xml:space="preserve">      5.4 Capa de Despliegue</w:t>
-      </w:r>
-    </w:p>
-    <w:p>
-      <w:pPr>
-        <w:spacing w:after="80"/>
-        <w:ind w:left="360"/>
-        <w:rPr>
-          <w:lang w:val="es-MX"/>
-        </w:rPr>
-      </w:pPr>
-      <w:r>
-        <w:rPr>
-          <w:color w:val="000000"/>
-          <w:lang w:val="es-MX"/>
-        </w:rPr>
-        <w:t xml:space="preserve">      5.5 Control de versiones</w:t>
+        <w:t>6.  Stack tecnológico seleccionado</w:t>
       </w:r>
     </w:p>
     <w:p>
@@ -878,7 +768,7 @@
           <w:color w:val="000000"/>
           <w:lang w:val="es-MX"/>
         </w:rPr>
-        <w:t>6.  Stack tecnológico seleccionado</w:t>
+        <w:t>7.  Plan de mitigación de riesgos técnicos</w:t>
       </w:r>
     </w:p>
     <w:p>
@@ -895,23 +785,6 @@
           <w:color w:val="000000"/>
           <w:lang w:val="es-MX"/>
         </w:rPr>
-        <w:t>7.  Plan de mitigación de riesgos técnicos</w:t>
-      </w:r>
-    </w:p>
-    <w:p>
-      <w:pPr>
-        <w:spacing w:after="80"/>
-        <w:rPr>
-          <w:lang w:val="es-MX"/>
-        </w:rPr>
-      </w:pPr>
-      <w:r>
-        <w:rPr>
-          <w:b/>
-          <w:bCs/>
-          <w:color w:val="000000"/>
-          <w:lang w:val="es-MX"/>
-        </w:rPr>
         <w:t>8.  Conclusiones</w:t>
       </w:r>
     </w:p>
@@ -956,23 +829,7 @@
           <w:color w:val="000000"/>
           <w:lang w:val="es-MX"/>
         </w:rPr>
-        <w:t>El presente estudio analiza la factibilidad técnica de SIGECOP, un sistema web para la gestión del ciclo administrativo de contratos de obra pública conforme a la LOPSRM. El sistema cubre siete módulos funcionales con un total de 21 servicios, distribuidos para ejecutarse en nueve iteraciones de desarrollo (</w:t>
-      </w:r>
-      <w:proofErr w:type="spellStart"/>
-      <w:r>
-        <w:rPr>
-          <w:color w:val="000000"/>
-          <w:lang w:val="es-MX"/>
-        </w:rPr>
-        <w:t>sprints</w:t>
-      </w:r>
-      <w:proofErr w:type="spellEnd"/>
-      <w:r>
-        <w:rPr>
-          <w:color w:val="000000"/>
-          <w:lang w:val="es-MX"/>
-        </w:rPr>
-        <w:t>) por un equipo de tres personas.</w:t>
+        <w:t>El presente estudio analiza la factibilidad técnica de SIGECOP, un sistema web para la gestión del ciclo administrativo de contratos de obra pública conforme a la LOPSRM. El sistema cubre siete módulos funcionales con un total de 21 servicios, distribuidos para ejecutarse en nueve iteraciones de desarrollo (sprints) por un equipo de tres personas.</w:t>
       </w:r>
     </w:p>
     <w:p>
@@ -1004,23 +861,7 @@
           <w:color w:val="000000"/>
           <w:lang w:val="es-MX"/>
         </w:rPr>
-        <w:t xml:space="preserve">La decisión consolidada del estudio es construir SIGECOP sobre el siguiente </w:t>
-      </w:r>
-      <w:proofErr w:type="spellStart"/>
-      <w:r>
-        <w:rPr>
-          <w:color w:val="000000"/>
-          <w:lang w:val="es-MX"/>
-        </w:rPr>
-        <w:t>stack</w:t>
-      </w:r>
-      <w:proofErr w:type="spellEnd"/>
-      <w:r>
-        <w:rPr>
-          <w:color w:val="000000"/>
-          <w:lang w:val="es-MX"/>
-        </w:rPr>
-        <w:t>:</w:t>
+        <w:t>La decisión consolidada del estudio es construir SIGECOP sobre el siguiente stack:</w:t>
       </w:r>
     </w:p>
     <w:p>
@@ -1248,23 +1089,92 @@
             <w:vAlign w:val="center"/>
           </w:tcPr>
           <w:p>
-            <w:proofErr w:type="spellStart"/>
             <w:r>
               <w:rPr>
                 <w:b/>
                 <w:bCs/>
                 <w:color w:val="000000"/>
               </w:rPr>
-              <w:t>Lógica</w:t>
-            </w:r>
-            <w:proofErr w:type="spellEnd"/>
+              <w:t>Lógica (Backend)</w:t>
+            </w:r>
+          </w:p>
+        </w:tc>
+        <w:tc>
+          <w:tcPr>
+            <w:tcW w:w="6874" w:type="dxa"/>
+            <w:tcBorders>
+              <w:top w:val="single" w:sz="4" w:space="0" w:color="BFBFBF"/>
+              <w:left w:val="single" w:sz="4" w:space="0" w:color="BFBFBF"/>
+              <w:bottom w:val="single" w:sz="4" w:space="0" w:color="BFBFBF"/>
+              <w:right w:val="single" w:sz="4" w:space="0" w:color="BFBFBF"/>
+            </w:tcBorders>
+            <w:tcMar>
+              <w:top w:w="100" w:type="dxa"/>
+              <w:left w:w="140" w:type="dxa"/>
+              <w:bottom w:w="100" w:type="dxa"/>
+              <w:right w:w="140" w:type="dxa"/>
+            </w:tcMar>
+            <w:vAlign w:val="center"/>
+          </w:tcPr>
+          <w:p>
+            <w:r>
+              <w:rPr>
+                <w:color w:val="000000"/>
+              </w:rPr>
+              <w:t>Node.js + Express</w:t>
+            </w:r>
+          </w:p>
+        </w:tc>
+        <w:tc>
+          <w:tcPr>
+            <w:tcW w:w="300" w:type="dxa"/>
+            <w:tcBorders>
+              <w:top w:val="single" w:sz="4" w:space="0" w:color="BFBFBF"/>
+              <w:left w:val="single" w:sz="4" w:space="0" w:color="BFBFBF"/>
+              <w:bottom w:val="single" w:sz="4" w:space="0" w:color="BFBFBF"/>
+              <w:right w:val="single" w:sz="4" w:space="0" w:color="BFBFBF"/>
+            </w:tcBorders>
+            <w:tcMar>
+              <w:top w:w="100" w:type="dxa"/>
+              <w:left w:w="140" w:type="dxa"/>
+              <w:bottom w:w="100" w:type="dxa"/>
+              <w:right w:w="140" w:type="dxa"/>
+            </w:tcMar>
+            <w:vAlign w:val="center"/>
+          </w:tcPr>
+          <w:p>
+            <w:pPr>
+              <w:jc w:val="center"/>
+            </w:pPr>
+          </w:p>
+        </w:tc>
+      </w:tr>
+      <w:tr>
+        <w:tc>
+          <w:tcPr>
+            <w:tcW w:w="2200" w:type="dxa"/>
+            <w:tcBorders>
+              <w:top w:val="single" w:sz="4" w:space="0" w:color="BFBFBF"/>
+              <w:left w:val="single" w:sz="4" w:space="0" w:color="BFBFBF"/>
+              <w:bottom w:val="single" w:sz="4" w:space="0" w:color="BFBFBF"/>
+              <w:right w:val="single" w:sz="4" w:space="0" w:color="BFBFBF"/>
+            </w:tcBorders>
+            <w:tcMar>
+              <w:top w:w="100" w:type="dxa"/>
+              <w:left w:w="140" w:type="dxa"/>
+              <w:bottom w:w="100" w:type="dxa"/>
+              <w:right w:w="140" w:type="dxa"/>
+            </w:tcMar>
+            <w:vAlign w:val="center"/>
+          </w:tcPr>
+          <w:p>
             <w:r>
               <w:rPr>
                 <w:b/>
                 <w:bCs/>
                 <w:color w:val="000000"/>
               </w:rPr>
-              <w:t xml:space="preserve"> (Backend)</w:t>
+              <w:t>Datos</w:t>
             </w:r>
           </w:p>
         </w:tc>
@@ -1290,7 +1200,7 @@
               <w:rPr>
                 <w:color w:val="000000"/>
               </w:rPr>
-              <w:t>Node.js + Express</w:t>
+              <w:t>PostgreSQL</w:t>
             </w:r>
           </w:p>
         </w:tc>
@@ -1343,7 +1253,7 @@
                 <w:bCs/>
                 <w:color w:val="000000"/>
               </w:rPr>
-              <w:t>Datos</w:t>
+              <w:t>Despliegue</w:t>
             </w:r>
           </w:p>
         </w:tc>
@@ -1369,7 +1279,7 @@
               <w:rPr>
                 <w:color w:val="000000"/>
               </w:rPr>
-              <w:t>PostgreSQL</w:t>
+              <w:t>Docker + Render</w:t>
             </w:r>
           </w:p>
         </w:tc>
@@ -1416,105 +1326,14 @@
             <w:vAlign w:val="center"/>
           </w:tcPr>
           <w:p>
-            <w:proofErr w:type="spellStart"/>
             <w:r>
               <w:rPr>
                 <w:b/>
                 <w:bCs/>
                 <w:color w:val="000000"/>
               </w:rPr>
-              <w:t>Despliegue</w:t>
-            </w:r>
-            <w:proofErr w:type="spellEnd"/>
-          </w:p>
-        </w:tc>
-        <w:tc>
-          <w:tcPr>
-            <w:tcW w:w="6874" w:type="dxa"/>
-            <w:tcBorders>
-              <w:top w:val="single" w:sz="4" w:space="0" w:color="BFBFBF"/>
-              <w:left w:val="single" w:sz="4" w:space="0" w:color="BFBFBF"/>
-              <w:bottom w:val="single" w:sz="4" w:space="0" w:color="BFBFBF"/>
-              <w:right w:val="single" w:sz="4" w:space="0" w:color="BFBFBF"/>
-            </w:tcBorders>
-            <w:tcMar>
-              <w:top w:w="100" w:type="dxa"/>
-              <w:left w:w="140" w:type="dxa"/>
-              <w:bottom w:w="100" w:type="dxa"/>
-              <w:right w:w="140" w:type="dxa"/>
-            </w:tcMar>
-            <w:vAlign w:val="center"/>
-          </w:tcPr>
-          <w:p>
-            <w:r>
-              <w:rPr>
-                <w:color w:val="000000"/>
-              </w:rPr>
-              <w:t>Docker + Render</w:t>
-            </w:r>
-          </w:p>
-        </w:tc>
-        <w:tc>
-          <w:tcPr>
-            <w:tcW w:w="300" w:type="dxa"/>
-            <w:tcBorders>
-              <w:top w:val="single" w:sz="4" w:space="0" w:color="BFBFBF"/>
-              <w:left w:val="single" w:sz="4" w:space="0" w:color="BFBFBF"/>
-              <w:bottom w:val="single" w:sz="4" w:space="0" w:color="BFBFBF"/>
-              <w:right w:val="single" w:sz="4" w:space="0" w:color="BFBFBF"/>
-            </w:tcBorders>
-            <w:tcMar>
-              <w:top w:w="100" w:type="dxa"/>
-              <w:left w:w="140" w:type="dxa"/>
-              <w:bottom w:w="100" w:type="dxa"/>
-              <w:right w:w="140" w:type="dxa"/>
-            </w:tcMar>
-            <w:vAlign w:val="center"/>
-          </w:tcPr>
-          <w:p>
-            <w:pPr>
-              <w:jc w:val="center"/>
-            </w:pPr>
-          </w:p>
-        </w:tc>
-      </w:tr>
-      <w:tr>
-        <w:tc>
-          <w:tcPr>
-            <w:tcW w:w="2200" w:type="dxa"/>
-            <w:tcBorders>
-              <w:top w:val="single" w:sz="4" w:space="0" w:color="BFBFBF"/>
-              <w:left w:val="single" w:sz="4" w:space="0" w:color="BFBFBF"/>
-              <w:bottom w:val="single" w:sz="4" w:space="0" w:color="BFBFBF"/>
-              <w:right w:val="single" w:sz="4" w:space="0" w:color="BFBFBF"/>
-            </w:tcBorders>
-            <w:tcMar>
-              <w:top w:w="100" w:type="dxa"/>
-              <w:left w:w="140" w:type="dxa"/>
-              <w:bottom w:w="100" w:type="dxa"/>
-              <w:right w:w="140" w:type="dxa"/>
-            </w:tcMar>
-            <w:vAlign w:val="center"/>
-          </w:tcPr>
-          <w:p>
-            <w:r>
-              <w:rPr>
-                <w:b/>
-                <w:bCs/>
-                <w:color w:val="000000"/>
-              </w:rPr>
-              <w:t xml:space="preserve">Control de </w:t>
-            </w:r>
-            <w:proofErr w:type="spellStart"/>
-            <w:r>
-              <w:rPr>
-                <w:b/>
-                <w:bCs/>
-                <w:color w:val="000000"/>
-              </w:rPr>
-              <w:t>versiones</w:t>
-            </w:r>
-            <w:proofErr w:type="spellEnd"/>
+              <w:t>Control de versiones</w:t>
+            </w:r>
           </w:p>
         </w:tc>
         <w:tc>
@@ -1609,23 +1428,7 @@
           <w:color w:val="000000"/>
           <w:lang w:val="es-MX"/>
         </w:rPr>
-        <w:t xml:space="preserve">Conclusión del estudio: el proyecto SIGECOP es técnicamente factible bajo el </w:t>
-      </w:r>
-      <w:proofErr w:type="spellStart"/>
-      <w:r>
-        <w:rPr>
-          <w:color w:val="000000"/>
-          <w:lang w:val="es-MX"/>
-        </w:rPr>
-        <w:t>stack</w:t>
-      </w:r>
-      <w:proofErr w:type="spellEnd"/>
-      <w:r>
-        <w:rPr>
-          <w:color w:val="000000"/>
-          <w:lang w:val="es-MX"/>
-        </w:rPr>
-        <w:t xml:space="preserve"> propuesto. Los riesgos identificados son moderados y todos cuentan con planes de mitigación documentados. Se recomienda iniciar el Sprint 1 conforme al plan de iteraciones del Excel de historias de usuario.</w:t>
+        <w:t>Conclusión del estudio: el proyecto SIGECOP es técnicamente factible bajo el stack propuesto. Los riesgos identificados son moderados y todos cuentan con planes de mitigación documentados. Se recomienda iniciar el Sprint 1 conforme al plan de iteraciones del Excel de historias de usuario.</w:t>
       </w:r>
     </w:p>
     <w:p>
@@ -1914,7 +1717,6 @@
             <w:pPr>
               <w:jc w:val="center"/>
             </w:pPr>
-            <w:proofErr w:type="spellStart"/>
             <w:r>
               <w:rPr>
                 <w:b/>
@@ -1925,7 +1727,6 @@
               </w:rPr>
               <w:t>Restricción</w:t>
             </w:r>
-            <w:proofErr w:type="spellEnd"/>
           </w:p>
         </w:tc>
         <w:tc>
@@ -1950,7 +1751,6 @@
             <w:pPr>
               <w:jc w:val="center"/>
             </w:pPr>
-            <w:proofErr w:type="spellStart"/>
             <w:r>
               <w:rPr>
                 <w:b/>
@@ -1961,7 +1761,6 @@
               </w:rPr>
               <w:t>Descripción</w:t>
             </w:r>
-            <w:proofErr w:type="spellEnd"/>
           </w:p>
         </w:tc>
       </w:tr>
@@ -1984,34 +1783,138 @@
             <w:vAlign w:val="center"/>
           </w:tcPr>
           <w:p>
-            <w:proofErr w:type="spellStart"/>
             <w:r>
               <w:rPr>
                 <w:b/>
                 <w:bCs/>
                 <w:color w:val="000000"/>
               </w:rPr>
-              <w:t>Tamaño</w:t>
-            </w:r>
-            <w:proofErr w:type="spellEnd"/>
+              <w:t>Tamaño del equipo</w:t>
+            </w:r>
+          </w:p>
+        </w:tc>
+        <w:tc>
+          <w:tcPr>
+            <w:tcW w:w="6500" w:type="dxa"/>
+            <w:tcBorders>
+              <w:top w:val="single" w:sz="4" w:space="0" w:color="BFBFBF"/>
+              <w:left w:val="single" w:sz="4" w:space="0" w:color="BFBFBF"/>
+              <w:bottom w:val="single" w:sz="4" w:space="0" w:color="BFBFBF"/>
+              <w:right w:val="single" w:sz="4" w:space="0" w:color="BFBFBF"/>
+            </w:tcBorders>
+            <w:tcMar>
+              <w:top w:w="100" w:type="dxa"/>
+              <w:left w:w="140" w:type="dxa"/>
+              <w:bottom w:w="100" w:type="dxa"/>
+              <w:right w:w="140" w:type="dxa"/>
+            </w:tcMar>
+            <w:vAlign w:val="center"/>
+          </w:tcPr>
+          <w:p>
+            <w:pPr>
+              <w:rPr>
+                <w:lang w:val="es-MX"/>
+              </w:rPr>
+            </w:pPr>
+            <w:r>
+              <w:rPr>
+                <w:color w:val="000000"/>
+                <w:lang w:val="es-MX"/>
+              </w:rPr>
+              <w:t>3 integrantes. Las decisiones técnicas no pueden requerir más manos para ser viables.</w:t>
+            </w:r>
+          </w:p>
+        </w:tc>
+      </w:tr>
+      <w:tr>
+        <w:tc>
+          <w:tcPr>
+            <w:tcW w:w="2860" w:type="dxa"/>
+            <w:tcBorders>
+              <w:top w:val="single" w:sz="4" w:space="0" w:color="BFBFBF"/>
+              <w:left w:val="single" w:sz="4" w:space="0" w:color="BFBFBF"/>
+              <w:bottom w:val="single" w:sz="4" w:space="0" w:color="BFBFBF"/>
+              <w:right w:val="single" w:sz="4" w:space="0" w:color="BFBFBF"/>
+            </w:tcBorders>
+            <w:tcMar>
+              <w:top w:w="100" w:type="dxa"/>
+              <w:left w:w="140" w:type="dxa"/>
+              <w:bottom w:w="100" w:type="dxa"/>
+              <w:right w:w="140" w:type="dxa"/>
+            </w:tcMar>
+            <w:vAlign w:val="center"/>
+          </w:tcPr>
+          <w:p>
             <w:r>
               <w:rPr>
                 <w:b/>
                 <w:bCs/>
                 <w:color w:val="000000"/>
               </w:rPr>
-              <w:t xml:space="preserve"> del </w:t>
-            </w:r>
-            <w:proofErr w:type="spellStart"/>
+              <w:t>Tiempo disponible</w:t>
+            </w:r>
+          </w:p>
+        </w:tc>
+        <w:tc>
+          <w:tcPr>
+            <w:tcW w:w="6500" w:type="dxa"/>
+            <w:tcBorders>
+              <w:top w:val="single" w:sz="4" w:space="0" w:color="BFBFBF"/>
+              <w:left w:val="single" w:sz="4" w:space="0" w:color="BFBFBF"/>
+              <w:bottom w:val="single" w:sz="4" w:space="0" w:color="BFBFBF"/>
+              <w:right w:val="single" w:sz="4" w:space="0" w:color="BFBFBF"/>
+            </w:tcBorders>
+            <w:tcMar>
+              <w:top w:w="100" w:type="dxa"/>
+              <w:left w:w="140" w:type="dxa"/>
+              <w:bottom w:w="100" w:type="dxa"/>
+              <w:right w:w="140" w:type="dxa"/>
+            </w:tcMar>
+            <w:vAlign w:val="center"/>
+          </w:tcPr>
+          <w:p>
+            <w:pPr>
+              <w:rPr>
+                <w:lang w:val="es-MX"/>
+              </w:rPr>
+            </w:pPr>
+            <w:r>
+              <w:rPr>
+                <w:color w:val="000000"/>
+                <w:lang w:val="es-MX"/>
+              </w:rPr>
+              <w:t>Entrega final en junio 2026. Nueve sprints de una semana cada uno aproximadamente.</w:t>
+            </w:r>
+          </w:p>
+        </w:tc>
+      </w:tr>
+      <w:tr>
+        <w:tc>
+          <w:tcPr>
+            <w:tcW w:w="2860" w:type="dxa"/>
+            <w:tcBorders>
+              <w:top w:val="single" w:sz="4" w:space="0" w:color="BFBFBF"/>
+              <w:left w:val="single" w:sz="4" w:space="0" w:color="BFBFBF"/>
+              <w:bottom w:val="single" w:sz="4" w:space="0" w:color="BFBFBF"/>
+              <w:right w:val="single" w:sz="4" w:space="0" w:color="BFBFBF"/>
+            </w:tcBorders>
+            <w:tcMar>
+              <w:top w:w="100" w:type="dxa"/>
+              <w:left w:w="140" w:type="dxa"/>
+              <w:bottom w:w="100" w:type="dxa"/>
+              <w:right w:w="140" w:type="dxa"/>
+            </w:tcMar>
+            <w:vAlign w:val="center"/>
+          </w:tcPr>
+          <w:p>
             <w:r>
               <w:rPr>
                 <w:b/>
                 <w:bCs/>
                 <w:color w:val="000000"/>
               </w:rPr>
-              <w:t>equipo</w:t>
-            </w:r>
-            <w:proofErr w:type="spellEnd"/>
+              <w:t>Concurrencia esperada</w:t>
+            </w:r>
           </w:p>
         </w:tc>
         <w:tc>
@@ -2042,7 +1945,7 @@
                 <w:color w:val="000000"/>
                 <w:lang w:val="es-MX"/>
               </w:rPr>
-              <w:t>3 integrantes. Las decisiones técnicas no pueden requerir más manos para ser viables.</w:t>
+              <w:t>Máximo cinco usuarios concurrentes. No se requieren tecnologías diseñadas para alta escala.</w:t>
             </w:r>
           </w:p>
         </w:tc>
@@ -2072,170 +1975,8 @@
                 <w:bCs/>
                 <w:color w:val="000000"/>
               </w:rPr>
-              <w:t>Tiempo disponible</w:t>
-            </w:r>
-          </w:p>
-        </w:tc>
-        <w:tc>
-          <w:tcPr>
-            <w:tcW w:w="6500" w:type="dxa"/>
-            <w:tcBorders>
-              <w:top w:val="single" w:sz="4" w:space="0" w:color="BFBFBF"/>
-              <w:left w:val="single" w:sz="4" w:space="0" w:color="BFBFBF"/>
-              <w:bottom w:val="single" w:sz="4" w:space="0" w:color="BFBFBF"/>
-              <w:right w:val="single" w:sz="4" w:space="0" w:color="BFBFBF"/>
-            </w:tcBorders>
-            <w:tcMar>
-              <w:top w:w="100" w:type="dxa"/>
-              <w:left w:w="140" w:type="dxa"/>
-              <w:bottom w:w="100" w:type="dxa"/>
-              <w:right w:w="140" w:type="dxa"/>
-            </w:tcMar>
-            <w:vAlign w:val="center"/>
-          </w:tcPr>
-          <w:p>
-            <w:pPr>
-              <w:rPr>
-                <w:lang w:val="es-MX"/>
-              </w:rPr>
-            </w:pPr>
-            <w:r>
-              <w:rPr>
-                <w:color w:val="000000"/>
-                <w:lang w:val="es-MX"/>
-              </w:rPr>
-              <w:t xml:space="preserve">Entrega final en junio 2026. Nueve </w:t>
-            </w:r>
-            <w:proofErr w:type="spellStart"/>
-            <w:r>
-              <w:rPr>
-                <w:color w:val="000000"/>
-                <w:lang w:val="es-MX"/>
-              </w:rPr>
-              <w:t>sprints</w:t>
-            </w:r>
-            <w:proofErr w:type="spellEnd"/>
-            <w:r>
-              <w:rPr>
-                <w:color w:val="000000"/>
-                <w:lang w:val="es-MX"/>
-              </w:rPr>
-              <w:t xml:space="preserve"> de una semana cada uno aproximadamente.</w:t>
-            </w:r>
-          </w:p>
-        </w:tc>
-      </w:tr>
-      <w:tr>
-        <w:tc>
-          <w:tcPr>
-            <w:tcW w:w="2860" w:type="dxa"/>
-            <w:tcBorders>
-              <w:top w:val="single" w:sz="4" w:space="0" w:color="BFBFBF"/>
-              <w:left w:val="single" w:sz="4" w:space="0" w:color="BFBFBF"/>
-              <w:bottom w:val="single" w:sz="4" w:space="0" w:color="BFBFBF"/>
-              <w:right w:val="single" w:sz="4" w:space="0" w:color="BFBFBF"/>
-            </w:tcBorders>
-            <w:tcMar>
-              <w:top w:w="100" w:type="dxa"/>
-              <w:left w:w="140" w:type="dxa"/>
-              <w:bottom w:w="100" w:type="dxa"/>
-              <w:right w:w="140" w:type="dxa"/>
-            </w:tcMar>
-            <w:vAlign w:val="center"/>
-          </w:tcPr>
-          <w:p>
-            <w:proofErr w:type="spellStart"/>
-            <w:r>
-              <w:rPr>
-                <w:b/>
-                <w:bCs/>
-                <w:color w:val="000000"/>
-              </w:rPr>
-              <w:t>Concurrencia</w:t>
-            </w:r>
-            <w:proofErr w:type="spellEnd"/>
-            <w:r>
-              <w:rPr>
-                <w:b/>
-                <w:bCs/>
-                <w:color w:val="000000"/>
-              </w:rPr>
-              <w:t xml:space="preserve"> </w:t>
-            </w:r>
-            <w:proofErr w:type="spellStart"/>
-            <w:r>
-              <w:rPr>
-                <w:b/>
-                <w:bCs/>
-                <w:color w:val="000000"/>
-              </w:rPr>
-              <w:t>esperada</w:t>
-            </w:r>
-            <w:proofErr w:type="spellEnd"/>
-          </w:p>
-        </w:tc>
-        <w:tc>
-          <w:tcPr>
-            <w:tcW w:w="6500" w:type="dxa"/>
-            <w:tcBorders>
-              <w:top w:val="single" w:sz="4" w:space="0" w:color="BFBFBF"/>
-              <w:left w:val="single" w:sz="4" w:space="0" w:color="BFBFBF"/>
-              <w:bottom w:val="single" w:sz="4" w:space="0" w:color="BFBFBF"/>
-              <w:right w:val="single" w:sz="4" w:space="0" w:color="BFBFBF"/>
-            </w:tcBorders>
-            <w:tcMar>
-              <w:top w:w="100" w:type="dxa"/>
-              <w:left w:w="140" w:type="dxa"/>
-              <w:bottom w:w="100" w:type="dxa"/>
-              <w:right w:w="140" w:type="dxa"/>
-            </w:tcMar>
-            <w:vAlign w:val="center"/>
-          </w:tcPr>
-          <w:p>
-            <w:pPr>
-              <w:rPr>
-                <w:lang w:val="es-MX"/>
-              </w:rPr>
-            </w:pPr>
-            <w:r>
-              <w:rPr>
-                <w:color w:val="000000"/>
-                <w:lang w:val="es-MX"/>
-              </w:rPr>
-              <w:t>Máximo cinco usuarios concurrentes. No se requieren tecnologías diseñadas para alta escala.</w:t>
-            </w:r>
-          </w:p>
-        </w:tc>
-      </w:tr>
-      <w:tr>
-        <w:tc>
-          <w:tcPr>
-            <w:tcW w:w="2860" w:type="dxa"/>
-            <w:tcBorders>
-              <w:top w:val="single" w:sz="4" w:space="0" w:color="BFBFBF"/>
-              <w:left w:val="single" w:sz="4" w:space="0" w:color="BFBFBF"/>
-              <w:bottom w:val="single" w:sz="4" w:space="0" w:color="BFBFBF"/>
-              <w:right w:val="single" w:sz="4" w:space="0" w:color="BFBFBF"/>
-            </w:tcBorders>
-            <w:tcMar>
-              <w:top w:w="100" w:type="dxa"/>
-              <w:left w:w="140" w:type="dxa"/>
-              <w:bottom w:w="100" w:type="dxa"/>
-              <w:right w:w="140" w:type="dxa"/>
-            </w:tcMar>
-            <w:vAlign w:val="center"/>
-          </w:tcPr>
-          <w:p>
-            <w:proofErr w:type="spellStart"/>
-            <w:r>
-              <w:rPr>
-                <w:b/>
-                <w:bCs/>
-                <w:color w:val="000000"/>
-              </w:rPr>
               <w:t>Presupuesto</w:t>
             </w:r>
-            <w:proofErr w:type="spellEnd"/>
           </w:p>
         </w:tc>
         <w:tc>
@@ -2441,31 +2182,7 @@
         <w:pStyle w:val="Heading2"/>
       </w:pPr>
       <w:r>
-        <w:t xml:space="preserve">3.1 </w:t>
-      </w:r>
-      <w:proofErr w:type="spellStart"/>
-      <w:r>
-        <w:t>Atributos</w:t>
-      </w:r>
-      <w:proofErr w:type="spellEnd"/>
-      <w:r>
-        <w:t xml:space="preserve"> </w:t>
-      </w:r>
-      <w:proofErr w:type="spellStart"/>
-      <w:r>
-        <w:t>técnicos</w:t>
-      </w:r>
-      <w:proofErr w:type="spellEnd"/>
-      <w:r>
-        <w:t xml:space="preserve"> </w:t>
-      </w:r>
-      <w:proofErr w:type="spellStart"/>
-      <w:r>
-        <w:t>válidos</w:t>
-      </w:r>
-      <w:proofErr w:type="spellEnd"/>
-      <w:r>
-        <w:t xml:space="preserve"> para SIGECOP</w:t>
+        <w:t>3.1 Atributos técnicos válidos para SIGECOP</w:t>
       </w:r>
     </w:p>
     <w:p>
@@ -2551,8 +2268,6 @@
             <w:pPr>
               <w:jc w:val="center"/>
             </w:pPr>
-            <w:proofErr w:type="spellStart"/>
-            <w:proofErr w:type="spellEnd"/>
             <w:r>
               <w:rPr>
                 <w:rFonts w:ascii="Arial" w:hAnsi="Arial"/>
@@ -2586,10 +2301,6 @@
             <w:pPr>
               <w:jc w:val="center"/>
             </w:pPr>
-            <w:proofErr w:type="spellStart"/>
-            <w:proofErr w:type="spellEnd"/>
-            <w:proofErr w:type="spellStart"/>
-            <w:proofErr w:type="spellEnd"/>
             <w:r>
               <w:rPr>
                 <w:rFonts w:ascii="Arial" w:hAnsi="Arial"/>
@@ -2654,8 +2365,6 @@
             <w:vAlign w:val="center"/>
           </w:tcPr>
           <w:p>
-            <w:proofErr w:type="spellStart"/>
-            <w:proofErr w:type="spellEnd"/>
             <w:r>
               <w:rPr>
                 <w:rFonts w:ascii="Arial" w:hAnsi="Arial"/>
@@ -2684,18 +2393,6 @@
             <w:vAlign w:val="center"/>
           </w:tcPr>
           <w:p>
-            <w:proofErr w:type="spellStart"/>
-            <w:proofErr w:type="spellEnd"/>
-            <w:proofErr w:type="spellStart"/>
-            <w:proofErr w:type="spellEnd"/>
-            <w:proofErr w:type="spellStart"/>
-            <w:proofErr w:type="spellEnd"/>
-            <w:proofErr w:type="spellStart"/>
-            <w:proofErr w:type="spellEnd"/>
-            <w:proofErr w:type="spellStart"/>
-            <w:proofErr w:type="spellEnd"/>
-            <w:proofErr w:type="spellStart"/>
-            <w:proofErr w:type="spellEnd"/>
             <w:r>
               <w:rPr>
                 <w:rFonts w:ascii="Arial" w:hAnsi="Arial"/>
@@ -2758,12 +2455,6 @@
             <w:vAlign w:val="center"/>
           </w:tcPr>
           <w:p>
-            <w:proofErr w:type="spellStart"/>
-            <w:proofErr w:type="spellEnd"/>
-            <w:proofErr w:type="spellStart"/>
-            <w:proofErr w:type="spellEnd"/>
-            <w:proofErr w:type="spellStart"/>
-            <w:proofErr w:type="spellEnd"/>
             <w:r>
               <w:rPr>
                 <w:rFonts w:ascii="Arial" w:hAnsi="Arial"/>
@@ -2859,10 +2550,6 @@
             <w:vAlign w:val="center"/>
           </w:tcPr>
           <w:p>
-            <w:proofErr w:type="spellStart"/>
-            <w:proofErr w:type="spellEnd"/>
-            <w:proofErr w:type="spellStart"/>
-            <w:proofErr w:type="spellEnd"/>
             <w:r>
               <w:rPr>
                 <w:rFonts w:ascii="Arial" w:hAnsi="Arial"/>
@@ -2958,8 +2645,6 @@
             <w:vAlign w:val="center"/>
           </w:tcPr>
           <w:p>
-            <w:proofErr w:type="spellStart"/>
-            <w:proofErr w:type="spellEnd"/>
             <w:r>
               <w:rPr>
                 <w:rFonts w:ascii="Arial" w:hAnsi="Arial"/>
@@ -3055,10 +2740,6 @@
             <w:vAlign w:val="center"/>
           </w:tcPr>
           <w:p>
-            <w:proofErr w:type="spellStart"/>
-            <w:proofErr w:type="spellEnd"/>
-            <w:proofErr w:type="spellStart"/>
-            <w:proofErr w:type="spellEnd"/>
             <w:r>
               <w:rPr>
                 <w:rFonts w:ascii="Arial" w:hAnsi="Arial"/>
@@ -3087,14 +2768,6 @@
             <w:vAlign w:val="center"/>
           </w:tcPr>
           <w:p>
-            <w:proofErr w:type="spellStart"/>
-            <w:proofErr w:type="spellEnd"/>
-            <w:proofErr w:type="spellStart"/>
-            <w:proofErr w:type="spellEnd"/>
-            <w:proofErr w:type="spellStart"/>
-            <w:proofErr w:type="spellEnd"/>
-            <w:proofErr w:type="spellStart"/>
-            <w:proofErr w:type="spellEnd"/>
             <w:r>
               <w:rPr>
                 <w:rFonts w:ascii="Arial" w:hAnsi="Arial"/>
@@ -3157,8 +2830,6 @@
             <w:vAlign w:val="center"/>
           </w:tcPr>
           <w:p>
-            <w:proofErr w:type="spellStart"/>
-            <w:proofErr w:type="spellEnd"/>
             <w:r>
               <w:rPr>
                 <w:rFonts w:ascii="Arial" w:hAnsi="Arial"/>
@@ -3254,8 +2925,6 @@
             <w:vAlign w:val="center"/>
           </w:tcPr>
           <w:p>
-            <w:proofErr w:type="spellStart"/>
-            <w:proofErr w:type="spellEnd"/>
             <w:r>
               <w:rPr>
                 <w:rFonts w:ascii="Arial" w:hAnsi="Arial"/>
@@ -3434,24 +3103,6 @@
         </w:rPr>
         <w:t>Capa de Vista (Frontend). Es responsable de presentar la información al usuario y de capturar sus acciones. Se compone de cinco vistas, una por cada rol del sistema (Residente, Supervisión, Contratista/Superintendente, Dependencia, Finanzas). No contiene reglas de negocio ni accede directamente a la base de datos: toda petición pasa por el orquestador de la capa de Lógica.</w:t>
       </w:r>
-      <w:proofErr w:type="spellStart"/>
-      <w:r>
-        <w:rPr>
-          <w:b/>
-          <w:bCs/>
-          <w:color w:val="000000"/>
-          <w:lang w:val="es-MX"/>
-        </w:rPr>
-      </w:r>
-      <w:proofErr w:type="spellEnd"/>
-      <w:r>
-        <w:rPr>
-          <w:b/>
-          <w:bCs/>
-          <w:color w:val="000000"/>
-          <w:lang w:val="es-MX"/>
-        </w:rPr>
-      </w:r>
       <w:r>
         <w:rPr>
           <w:color w:val="000000"/>
@@ -3477,78 +3128,12 @@
         </w:rPr>
         <w:t>Capa de Lógica de Negocio (Backend). Recibe las peticiones de la capa de Vista a través de un orquestador único que actúa como interfaz de API REST. El orquestador autentica al usuario, verifica su rol (servicio Control de Accesos), enruta la petición al módulo correspondiente y devuelve la respuesta. Es donde reside toda la inteligencia del sistema y la única capa que puede comunicarse con los Datos.</w:t>
       </w:r>
-      <w:proofErr w:type="spellStart"/>
-      <w:r>
-        <w:rPr>
-          <w:b/>
-          <w:bCs/>
+      <w:r>
+        <w:rPr>
           <w:color w:val="000000"/>
           <w:lang w:val="es-MX"/>
         </w:rPr>
       </w:r>
-      <w:proofErr w:type="spellEnd"/>
-      <w:r>
-        <w:rPr>
-          <w:b/>
-          <w:bCs/>
-          <w:color w:val="000000"/>
-          <w:lang w:val="es-MX"/>
-        </w:rPr>
-      </w:r>
-      <w:r>
-        <w:rPr>
-          <w:color w:val="000000"/>
-          <w:lang w:val="es-MX"/>
-        </w:rPr>
-      </w:r>
-      <w:r>
-        <w:rPr>
-          <w:color w:val="000000"/>
-        </w:rPr>
-      </w:r>
-      <w:proofErr w:type="spellStart"/>
-      <w:r>
-        <w:rPr>
-          <w:color w:val="000000"/>
-        </w:rPr>
-      </w:r>
-      <w:proofErr w:type="spellEnd"/>
-      <w:r>
-        <w:rPr>
-          <w:color w:val="000000"/>
-        </w:rPr>
-      </w:r>
-      <w:proofErr w:type="spellStart"/>
-      <w:r>
-        <w:rPr>
-          <w:color w:val="000000"/>
-        </w:rPr>
-      </w:r>
-      <w:proofErr w:type="spellEnd"/>
-      <w:r>
-        <w:rPr>
-          <w:color w:val="000000"/>
-        </w:rPr>
-      </w:r>
-      <w:proofErr w:type="spellStart"/>
-      <w:r>
-        <w:rPr>
-          <w:color w:val="000000"/>
-        </w:rPr>
-      </w:r>
-      <w:proofErr w:type="spellEnd"/>
-      <w:r>
-        <w:rPr>
-          <w:color w:val="000000"/>
-        </w:rPr>
-      </w:r>
-      <w:proofErr w:type="spellStart"/>
-      <w:r>
-        <w:rPr>
-          <w:color w:val="000000"/>
-        </w:rPr>
-      </w:r>
-      <w:proofErr w:type="spellEnd"/>
       <w:r>
         <w:rPr>
           <w:color w:val="000000"/>
@@ -3585,49 +3170,7 @@
         <w:rPr>
           <w:color w:val="000000"/>
         </w:rPr>
-        <w:t xml:space="preserve">Solo se </w:t>
-      </w:r>
-      <w:proofErr w:type="spellStart"/>
-      <w:r>
-        <w:rPr>
-          <w:color w:val="000000"/>
-        </w:rPr>
-        <w:t>comunica</w:t>
-      </w:r>
-      <w:proofErr w:type="spellEnd"/>
-      <w:r>
-        <w:rPr>
-          <w:color w:val="000000"/>
-        </w:rPr>
-        <w:t xml:space="preserve"> con la </w:t>
-      </w:r>
-      <w:proofErr w:type="spellStart"/>
-      <w:r>
-        <w:rPr>
-          <w:color w:val="000000"/>
-        </w:rPr>
-        <w:t>capa</w:t>
-      </w:r>
-      <w:proofErr w:type="spellEnd"/>
-      <w:r>
-        <w:rPr>
-          <w:color w:val="000000"/>
-        </w:rPr>
-        <w:t xml:space="preserve"> de </w:t>
-      </w:r>
-      <w:proofErr w:type="spellStart"/>
-      <w:r>
-        <w:rPr>
-          <w:color w:val="000000"/>
-        </w:rPr>
-        <w:t>Lógica</w:t>
-      </w:r>
-      <w:proofErr w:type="spellEnd"/>
-      <w:r>
-        <w:rPr>
-          <w:color w:val="000000"/>
-        </w:rPr>
-        <w:t>.</w:t>
+        <w:t>Solo se comunica con la capa de Lógica.</w:t>
       </w:r>
     </w:p>
     <w:p>
@@ -3853,7 +3396,6 @@
             <w:pPr>
               <w:jc w:val="center"/>
             </w:pPr>
-            <w:proofErr w:type="spellStart"/>
             <w:r>
               <w:rPr>
                 <w:b/>
@@ -3864,7 +3406,6 @@
               </w:rPr>
               <w:t>Descripción</w:t>
             </w:r>
-            <w:proofErr w:type="spellEnd"/>
           </w:p>
         </w:tc>
       </w:tr>
@@ -3929,23 +3470,7 @@
                 <w:color w:val="000000"/>
                 <w:lang w:val="es-MX"/>
               </w:rPr>
-              <w:t xml:space="preserve">El residente abre el navegador, accede a SIGECOP y completa el formulario de Alta de contratos. Al hacer clic en Guardar, </w:t>
-            </w:r>
-            <w:proofErr w:type="spellStart"/>
-            <w:r>
-              <w:rPr>
-                <w:color w:val="000000"/>
-                <w:lang w:val="es-MX"/>
-              </w:rPr>
-              <w:t>React</w:t>
-            </w:r>
-            <w:proofErr w:type="spellEnd"/>
-            <w:r>
-              <w:rPr>
-                <w:color w:val="000000"/>
-                <w:lang w:val="es-MX"/>
-              </w:rPr>
-              <w:t xml:space="preserve"> captura los datos del formulario.</w:t>
+              <w:t>El residente abre el navegador, accede a SIGECOP y completa el formulario de Alta de contratos. Al hacer clic en Guardar, React captura los datos del formulario.</w:t>
             </w:r>
           </w:p>
         </w:tc>
@@ -4006,48 +3531,12 @@
                 <w:lang w:val="es-MX"/>
               </w:rPr>
             </w:pPr>
-            <w:proofErr w:type="spellStart"/>
             <w:r>
               <w:rPr>
                 <w:color w:val="000000"/>
                 <w:lang w:val="es-MX"/>
               </w:rPr>
-              <w:t>Tailwind CSS asegura que el formulario se haya renderizado correctamente en cualquier tamaño de pantalla. React envía los datos al backend mediante una llamada API REST con método POST y cuerpo en formato JSON.</w:t>
-            </w:r>
-            <w:proofErr w:type="spellEnd"/>
-            <w:r>
-              <w:rPr>
-                <w:color w:val="000000"/>
-                <w:lang w:val="es-MX"/>
-              </w:rPr>
-            </w:r>
-            <w:proofErr w:type="spellStart"/>
-            <w:r>
-              <w:rPr>
-                <w:color w:val="000000"/>
-                <w:lang w:val="es-MX"/>
-              </w:rPr>
-            </w:r>
-            <w:proofErr w:type="spellEnd"/>
-            <w:r>
-              <w:rPr>
-                <w:color w:val="000000"/>
-                <w:lang w:val="es-MX"/>
-              </w:rPr>
-            </w:r>
-            <w:proofErr w:type="spellStart"/>
-            <w:r>
-              <w:rPr>
-                <w:color w:val="000000"/>
-                <w:lang w:val="es-MX"/>
-              </w:rPr>
-            </w:r>
-            <w:proofErr w:type="spellEnd"/>
-            <w:r>
-              <w:rPr>
-                <w:color w:val="000000"/>
-                <w:lang w:val="es-MX"/>
-              </w:rPr>
+              <w:t>Tailwind CSS asegura que el formulario se haya renderizado correctamente en cualquier tamaño de pantalla. React envía los datos al backend mediante una llamada API REST (HTTP POST) con cuerpo en formato JSON.</w:t>
             </w:r>
           </w:p>
         </w:tc>
@@ -4179,23 +3668,7 @@
                 <w:color w:val="000000"/>
                 <w:lang w:val="es-MX"/>
               </w:rPr>
-              <w:t xml:space="preserve">El </w:t>
-            </w:r>
-            <w:proofErr w:type="spellStart"/>
-            <w:r>
-              <w:rPr>
-                <w:color w:val="000000"/>
-                <w:lang w:val="es-MX"/>
-              </w:rPr>
-              <w:t>backend</w:t>
-            </w:r>
-            <w:proofErr w:type="spellEnd"/>
-            <w:r>
-              <w:rPr>
-                <w:color w:val="000000"/>
-                <w:lang w:val="es-MX"/>
-              </w:rPr>
-              <w:t xml:space="preserve"> ejecuta una instrucción SQL INSERT contra PostgreSQL. PostgreSQL verifica la integridad referencial (que el contratista existe, que la dependencia es válida) y guarda físicamente el registro.</w:t>
+              <w:t>El backend ejecuta una instrucción SQL INSERT contra PostgreSQL. PostgreSQL verifica la integridad referencial (que el contratista existe, que la dependencia es válida) y guarda físicamente el registro.</w:t>
             </w:r>
           </w:p>
         </w:tc>
@@ -4261,39 +3734,7 @@
                 <w:color w:val="000000"/>
                 <w:lang w:val="es-MX"/>
               </w:rPr>
-              <w:t xml:space="preserve">PostgreSQL responde con el contrato guardado y su ID asignado. El </w:t>
-            </w:r>
-            <w:proofErr w:type="spellStart"/>
-            <w:r>
-              <w:rPr>
-                <w:color w:val="000000"/>
-                <w:lang w:val="es-MX"/>
-              </w:rPr>
-              <w:t>backend</w:t>
-            </w:r>
-            <w:proofErr w:type="spellEnd"/>
-            <w:r>
-              <w:rPr>
-                <w:color w:val="000000"/>
-                <w:lang w:val="es-MX"/>
-              </w:rPr>
-              <w:t xml:space="preserve"> lo formatea como JSON y lo envía de regreso al </w:t>
-            </w:r>
-            <w:proofErr w:type="spellStart"/>
-            <w:r>
-              <w:rPr>
-                <w:color w:val="000000"/>
-                <w:lang w:val="es-MX"/>
-              </w:rPr>
-              <w:t>frontend</w:t>
-            </w:r>
-            <w:proofErr w:type="spellEnd"/>
-            <w:r>
-              <w:rPr>
-                <w:color w:val="000000"/>
-                <w:lang w:val="es-MX"/>
-              </w:rPr>
-              <w:t>.</w:t>
+              <w:t>PostgreSQL responde con el contrato guardado y su ID asignado. El backend lo formatea como JSON y lo envía de regreso al frontend.</w:t>
             </w:r>
           </w:p>
         </w:tc>
@@ -4354,21 +3795,12 @@
                 <w:lang w:val="es-MX"/>
               </w:rPr>
             </w:pPr>
-            <w:proofErr w:type="spellStart"/>
             <w:r>
               <w:rPr>
                 <w:color w:val="000000"/>
                 <w:lang w:val="es-MX"/>
               </w:rPr>
-              <w:t>React</w:t>
-            </w:r>
-            <w:proofErr w:type="spellEnd"/>
-            <w:r>
-              <w:rPr>
-                <w:color w:val="000000"/>
-                <w:lang w:val="es-MX"/>
-              </w:rPr>
-              <w:t xml:space="preserve"> recibe la confirmación y actualiza la pantalla mostrando un mensaje de éxito y redirige al expediente del contrato.</w:t>
+              <w:t>React recibe la confirmación y actualiza la pantalla mostrando un mensaje de éxito y redirige al expediente del contrato.</w:t>
             </w:r>
           </w:p>
         </w:tc>
@@ -4397,7 +3829,7 @@
           <w:color w:val="555555"/>
           <w:lang w:val="es-MX"/>
         </w:rPr>
-        <w:t>El flujo completo se ejecuta en una sola interacción del usuario, sin recargas de página. Cada capa cumple su función exclusiva y ninguna invade el territorio de las otras: la Vista no accede a la base de datos, la Lógica no renderiza HTML, los Datos no aplican reglas de negocio.</w:t>
+        <w:t>Todo el flujo descrito ocurre en menos de un segundo. Cada capa cumple su función exclusiva y ninguna invade el territorio de las otras: la Vista no accede a la base de datos, la Lógica no renderiza HTML, los Datos no aplican reglas de negocio.</w:t>
       </w:r>
     </w:p>
     <w:p>
@@ -4455,21 +3887,7 @@
         <w:rPr>
           <w:lang w:val="es-MX"/>
         </w:rPr>
-        <w:t>5.1 Capa de Vista (</w:t>
-      </w:r>
-      <w:proofErr w:type="spellStart"/>
-      <w:r>
-        <w:rPr>
-          <w:lang w:val="es-MX"/>
-        </w:rPr>
-        <w:t>Frontend</w:t>
-      </w:r>
-      <w:proofErr w:type="spellEnd"/>
-      <w:r>
-        <w:rPr>
-          <w:lang w:val="es-MX"/>
-        </w:rPr>
-        <w:t>)</w:t>
+        <w:t>5.1 Capa de Vista (Frontend)</w:t>
       </w:r>
     </w:p>
     <w:p>
@@ -5451,13 +4869,8 @@
       <w:pPr>
         <w:pStyle w:val="Heading3"/>
       </w:pPr>
-      <w:proofErr w:type="spellStart"/>
-      <w:r>
-        <w:t>Decisión</w:t>
-      </w:r>
-      <w:proofErr w:type="spellEnd"/>
-      <w:r>
-        <w:t>: React 18 + Tailwind CSS 3</w:t>
+      <w:r>
+        <w:t>Decisión: React 18 + Tailwind CSS 3</w:t>
       </w:r>
     </w:p>
     <w:p>
@@ -5468,7 +4881,6 @@
           <w:lang w:val="es-MX"/>
         </w:rPr>
       </w:pPr>
-      <w:proofErr w:type="spellStart"/>
       <w:r>
         <w:rPr>
           <w:rFonts w:ascii="Arial" w:hAnsi="Arial"/>
@@ -5476,57 +4888,14 @@
           <w:sz w:val="22"/>
           <w:lang w:val="es-MX"/>
         </w:rPr>
-        <w:t>React + Tailwind gana en el balance de los cinco criterios aplicables. Curva de aprendizaje moderada (C1: 5–7 días), instalación razonable (C2: 2 GB de RAM), soporte responsive nativo a través de las clases utilitarias de Tailwind (C3: sm:, md:, lg: sin código adicional), licencia MIT sin costos (C5), y soporte de API REST a través de fetch() nativo del navegador (C7). Angular pierde decisivamente en C1 (14+ días) y C2 (4 GB de RAM, no disponible en los equipos del proyecto). Vue presenta menor curva absoluta (3–5 días) que React (5–7 días) para alguien sin experiencia previa. Sin embargo, el equipo cuenta con exposición previa al ecosistema React desde la formación universitaria, lo que reduce la curva efectiva del equipo por debajo de los 5–7 días reportados. Honestamente: las tres alternativas pueden construir SIGECOP; se elige React porque la curva efectiva del equipo —no la curva absoluta— es la métrica operativa para un proyecto con tiempo restringido.</w:t>
-      </w:r>
-      <w:proofErr w:type="spellEnd"/>
+        <w:t>React + Tailwind gana en el balance de los cinco criterios aplicables. Curva de aprendizaje moderada (C1: 5–7 días), instalación razonable (C2: 2 GB de RAM), soporte responsive nativo a través de las clases utilitarias de Tailwind (C3: sm:, md:, lg: sin código adicional), licencia MIT sin costos (C5), y soporte de API REST a través de fetch() nativo del navegador (C7). Angular pierde decisivamente en C1 (14+ días) y C2 (4 GB de RAM, no disponible en los equipos del proyecto). Vue es técnicamente equivalente a React. Honestamente: las tres alternativas pueden construir SIGECOP; se elige la que el equipo puede usar con menor curva de aprendizaje, dado que el tiempo es la restricción más fuerte del proyecto.</w:t>
+      </w:r>
       <w:r>
         <w:rPr>
           <w:color w:val="000000"/>
           <w:lang w:val="es-MX"/>
         </w:rPr>
       </w:r>
-      <w:proofErr w:type="spellStart"/>
-      <w:r>
-        <w:rPr>
-          <w:color w:val="000000"/>
-          <w:lang w:val="es-MX"/>
-        </w:rPr>
-      </w:r>
-      <w:proofErr w:type="spellEnd"/>
-      <w:r>
-        <w:rPr>
-          <w:color w:val="000000"/>
-          <w:lang w:val="es-MX"/>
-        </w:rPr>
-      </w:r>
-      <w:proofErr w:type="spellStart"/>
-      <w:r>
-        <w:rPr>
-          <w:color w:val="000000"/>
-          <w:lang w:val="es-MX"/>
-        </w:rPr>
-      </w:r>
-      <w:proofErr w:type="spellEnd"/>
-      <w:r>
-        <w:rPr>
-          <w:color w:val="000000"/>
-          <w:lang w:val="es-MX"/>
-        </w:rPr>
-      </w:r>
-      <w:proofErr w:type="spellStart"/>
-      <w:r>
-        <w:rPr>
-          <w:color w:val="000000"/>
-          <w:lang w:val="es-MX"/>
-        </w:rPr>
-      </w:r>
-      <w:proofErr w:type="spellEnd"/>
-      <w:r>
-        <w:rPr>
-          <w:color w:val="000000"/>
-          <w:lang w:val="es-MX"/>
-        </w:rPr>
-      </w:r>
     </w:p>
     <w:p>
       <w:pPr>
@@ -5553,21 +4922,7 @@
           <w:lang w:val="es-MX"/>
         </w:rPr>
         <w:lastRenderedPageBreak/>
-        <w:t>5.2 Capa de Lógica (</w:t>
-      </w:r>
-      <w:proofErr w:type="spellStart"/>
-      <w:r>
-        <w:rPr>
-          <w:lang w:val="es-MX"/>
-        </w:rPr>
-        <w:t>Backend</w:t>
-      </w:r>
-      <w:proofErr w:type="spellEnd"/>
-      <w:r>
-        <w:rPr>
-          <w:lang w:val="es-MX"/>
-        </w:rPr>
-        <w:t>)</w:t>
+        <w:t>5.2 Capa de Lógica (Backend)</w:t>
       </w:r>
     </w:p>
     <w:p>
@@ -5587,28 +4942,6 @@
         </w:rPr>
         <w:t>Se evaluaron tres plataformas para el servidor de aplicación. Cada una pertenece a un lenguaje distinto, lo que implica que la decisión del backend también determina el segundo lenguaje a aprender por el equipo. La diferencia técnica decisiva se concentra en C1 (curva de aprendizaje) y C6 (capacidad operativa).</w:t>
       </w:r>
-      <w:proofErr w:type="spellStart"/>
-      <w:r>
-        <w:rPr>
-          <w:color w:val="000000"/>
-          <w:lang w:val="es-MX"/>
-        </w:rPr>
-      </w:r>
-      <w:proofErr w:type="spellEnd"/>
-      <w:r>
-        <w:rPr>
-          <w:color w:val="000000"/>
-          <w:lang w:val="es-MX"/>
-        </w:rPr>
-      </w:r>
-      <w:proofErr w:type="spellStart"/>
-      <w:r>
-        <w:rPr>
-          <w:color w:val="000000"/>
-          <w:lang w:val="es-MX"/>
-        </w:rPr>
-      </w:r>
-      <w:proofErr w:type="spellEnd"/>
       <w:r>
         <w:rPr>
           <w:color w:val="000000"/>
@@ -6219,47 +5552,46 @@
             <w:vAlign w:val="center"/>
           </w:tcPr>
           <w:p>
-            <w:r>
+            <w:r/>
+            <w:r>
+              <w:rPr>
+                <w:rFonts w:ascii="Arial" w:hAnsi="Arial"/>
+                <w:sz w:val="18"/>
+              </w:rPr>
+              <w:t>N/A.</w:t>
+              <w:br/>
+              <w:t>Ígual, se delega a la BD.</w:t>
+            </w:r>
+          </w:p>
+        </w:tc>
+        <w:tc>
+          <w:tcPr>
+            <w:tcW w:w="2480" w:type="dxa"/>
+            <w:tcBorders>
+              <w:top w:val="single" w:sz="4" w:space="0" w:color="BFBFBF"/>
+              <w:left w:val="single" w:sz="4" w:space="0" w:color="BFBFBF"/>
+              <w:bottom w:val="single" w:sz="4" w:space="0" w:color="BFBFBF"/>
+              <w:right w:val="single" w:sz="4" w:space="0" w:color="BFBFBF"/>
+            </w:tcBorders>
+            <w:tcMar>
+              <w:top w:w="100" w:type="dxa"/>
+              <w:left w:w="140" w:type="dxa"/>
+              <w:bottom w:w="100" w:type="dxa"/>
+              <w:right w:w="140" w:type="dxa"/>
+            </w:tcMar>
+            <w:vAlign w:val="center"/>
+          </w:tcPr>
+          <w:p>
+            <w:r/>
+            <w:r>
+              <w:rPr>
+                <w:rFonts w:ascii="Arial" w:hAnsi="Arial"/>
+                <w:sz w:val="18"/>
+              </w:rPr>
               <w:t>N/A.</w:t>
               <w:br/>
               <w:t>Igual, se delega a la BD.</w:t>
             </w:r>
-            <w:r>
-              <w:rPr>
-                <w:rFonts w:ascii="Arial" w:hAnsi="Arial"/>
-                <w:sz w:val="18"/>
-              </w:rPr>
-            </w:r>
-          </w:p>
-        </w:tc>
-        <w:tc>
-          <w:tcPr>
-            <w:tcW w:w="2480" w:type="dxa"/>
-            <w:tcBorders>
-              <w:top w:val="single" w:sz="4" w:space="0" w:color="BFBFBF"/>
-              <w:left w:val="single" w:sz="4" w:space="0" w:color="BFBFBF"/>
-              <w:bottom w:val="single" w:sz="4" w:space="0" w:color="BFBFBF"/>
-              <w:right w:val="single" w:sz="4" w:space="0" w:color="BFBFBF"/>
-            </w:tcBorders>
-            <w:tcMar>
-              <w:top w:w="100" w:type="dxa"/>
-              <w:left w:w="140" w:type="dxa"/>
-              <w:bottom w:w="100" w:type="dxa"/>
-              <w:right w:w="140" w:type="dxa"/>
-            </w:tcMar>
-            <w:vAlign w:val="center"/>
-          </w:tcPr>
-          <w:p>
-            <w:r/>
-            <w:r>
-              <w:rPr>
-                <w:rFonts w:ascii="Arial" w:hAnsi="Arial"/>
-                <w:sz w:val="18"/>
-              </w:rPr>
-              <w:t>N/A.</w:t>
-              <w:br/>
-              <w:t>Igual, se delega a la BD.</w:t>
-            </w:r>
           </w:p>
         </w:tc>
       </w:tr>
@@ -6538,13 +5870,8 @@
       <w:pPr>
         <w:pStyle w:val="Heading3"/>
       </w:pPr>
-      <w:proofErr w:type="spellStart"/>
-      <w:r>
-        <w:t>Decisión</w:t>
-      </w:r>
-      <w:proofErr w:type="spellEnd"/>
-      <w:r>
-        <w:t>: Node.js 20 + Express 4</w:t>
+      <w:r>
+        <w:t>Decisión: Node.js 20 + Express 4</w:t>
       </w:r>
     </w:p>
     <w:p>
@@ -6564,14 +5891,6 @@
         </w:rPr>
         <w:t>Node.js + Express gana en C1 (3–5 días) por una razón estructural: el equipo ya usa JavaScript en la capa de Vista, lo que reduce a la mitad el esfuerzo de aprendizaje. En C6 supera a Python+Django (10 000 vs 2 000 peticiones por segundo) por su modelo I/O no bloqueante, adecuado para sistemas con muchas operaciones de base de datos como SIGECOP. PHP+Laravel es técnicamente capaz pero implica aprender un lenguaje adicional. Honestamente: las tres soluciones pueden hospedar SIGECOP; el factor decisivo es el lenguaje compartido con el frontend.</w:t>
       </w:r>
-      <w:proofErr w:type="spellStart"/>
-      <w:r>
-        <w:rPr>
-          <w:color w:val="000000"/>
-          <w:lang w:val="es-MX"/>
-        </w:rPr>
-      </w:r>
-      <w:proofErr w:type="spellEnd"/>
       <w:r>
         <w:rPr>
           <w:color w:val="000000"/>
@@ -6596,28 +5915,6 @@
         </w:rPr>
         <w:t>Express se elige como framework por su minimalismo. A diferencia de Django o Laravel —que vienen con sistema de autenticación, panel admin y ORM predefinidos—, Express deja al equipo elegir cada pieza. Para un equipo en formación, esto significa que se aprenden los conceptos del backend desde la base, no como cajas negras, y no se carga el proyecto con funcionalidad que no se va a usar. Express expone endpoints REST en pocas líneas con app.get(), app.post(), etc.</w:t>
       </w:r>
-      <w:proofErr w:type="spellStart"/>
-      <w:r>
-        <w:rPr>
-          <w:color w:val="000000"/>
-          <w:lang w:val="es-MX"/>
-        </w:rPr>
-      </w:r>
-      <w:proofErr w:type="spellEnd"/>
-      <w:r>
-        <w:rPr>
-          <w:color w:val="000000"/>
-          <w:lang w:val="es-MX"/>
-        </w:rPr>
-      </w:r>
-      <w:proofErr w:type="spellStart"/>
-      <w:r>
-        <w:rPr>
-          <w:color w:val="000000"/>
-          <w:lang w:val="es-MX"/>
-        </w:rPr>
-      </w:r>
-      <w:proofErr w:type="spellEnd"/>
       <w:r>
         <w:rPr>
           <w:color w:val="000000"/>
@@ -6670,28 +5967,6 @@
         </w:rPr>
         <w:t>Se evaluaron tres alternativas de almacenamiento que representan los tres paradigmas más comunes: relacional estricto (PostgreSQL), relacional clásico (MySQL) y documental no-relacional (Firebase Firestore). El criterio decisivo para este proyecto es C4 (integridad y transaccionalidad), porque SIGECOP maneja datos legales contractuales donde una pérdida de consistencia tiene consecuencias administrativas reales.</w:t>
       </w:r>
-      <w:proofErr w:type="spellStart"/>
-      <w:r>
-        <w:rPr>
-          <w:color w:val="000000"/>
-          <w:lang w:val="es-MX"/>
-        </w:rPr>
-      </w:r>
-      <w:proofErr w:type="spellEnd"/>
-      <w:r>
-        <w:rPr>
-          <w:color w:val="000000"/>
-          <w:lang w:val="es-MX"/>
-        </w:rPr>
-      </w:r>
-      <w:proofErr w:type="spellStart"/>
-      <w:r>
-        <w:rPr>
-          <w:color w:val="000000"/>
-          <w:lang w:val="es-MX"/>
-        </w:rPr>
-      </w:r>
-      <w:proofErr w:type="spellEnd"/>
       <w:r>
         <w:rPr>
           <w:color w:val="000000"/>
@@ -7659,13 +6934,8 @@
       <w:pPr>
         <w:pStyle w:val="Heading3"/>
       </w:pPr>
-      <w:proofErr w:type="spellStart"/>
-      <w:r>
-        <w:t>Decisión</w:t>
-      </w:r>
-      <w:proofErr w:type="spellEnd"/>
-      <w:r>
-        <w:t>: PostgreSQL 16</w:t>
+      <w:r>
+        <w:t>Decisión: PostgreSQL 16</w:t>
       </w:r>
     </w:p>
     <w:p>
@@ -7685,14 +6955,6 @@
         </w:rPr>
         <w:t>PostgreSQL gana por C4: implementa ACID completo con transacciones anidadas, savepoints y snapshots por defecto, sin depender de configuración del DBA. MySQL ofrece ACID solo con el motor InnoDB y requiere configuración explícita; el motor alternativo MyISAM no soporta transacciones. Firebase Firestore tiene transacciones limitadas a 500 documentos y no permite rollback cross-collection: insuficiente para flujos como "crear estimación + actualizar contrato + registrar evento de bitácora" que SIGECOP requiere atómicos.</w:t>
       </w:r>
-      <w:proofErr w:type="spellStart"/>
-      <w:r>
-        <w:rPr>
-          <w:color w:val="000000"/>
-          <w:lang w:val="es-MX"/>
-        </w:rPr>
-      </w:r>
-      <w:proofErr w:type="spellEnd"/>
       <w:r>
         <w:rPr>
           <w:color w:val="000000"/>
@@ -7717,28 +6979,6 @@
         </w:rPr>
         <w:t>En C5 (licenciamiento), PostgreSQL gana por licencia sin componente comercial; MySQL tiene riesgo de licenciamiento dual desde la adquisición por Oracle. En C6 (capacidad), PostgreSQL y MySQL son equivalentes y ambos superan ampliamente cualquier necesidad del proyecto académico; Firebase pierde por cuotas del plan gratuito (1 GB de almacenamiento, 50 000 lecturas/día). Honestamente: la decisión PostgreSQL vs MySQL se inclina hacia PostgreSQL porque su soporte ACID es completo por defecto, sin depender de elegir el motor correcto.</w:t>
       </w:r>
-      <w:proofErr w:type="spellStart"/>
-      <w:r>
-        <w:rPr>
-          <w:color w:val="000000"/>
-          <w:lang w:val="es-MX"/>
-        </w:rPr>
-      </w:r>
-      <w:proofErr w:type="spellEnd"/>
-      <w:r>
-        <w:rPr>
-          <w:color w:val="000000"/>
-          <w:lang w:val="es-MX"/>
-        </w:rPr>
-      </w:r>
-      <w:proofErr w:type="spellStart"/>
-      <w:r>
-        <w:rPr>
-          <w:color w:val="000000"/>
-          <w:lang w:val="es-MX"/>
-        </w:rPr>
-      </w:r>
-      <w:proofErr w:type="spellEnd"/>
       <w:r>
         <w:rPr>
           <w:color w:val="000000"/>
@@ -7808,7 +7048,7 @@
           <w:sz w:val="22"/>
           <w:lang w:val="es-MX"/>
         </w:rPr>
-        <w:t>Existen alternativas reales a Docker (Podman, containerd, LXC). La comparativa cuantitativa se presenta en la sección 5.4.1. Docker se mantiene como elección por su curva de aprendizaje menor para el equipo (C1: 3–5 días con tutoriales oficiales en español) y por su soporte directo en Render (despliegue desde Dockerfile sin configuración adicional). Las alternativas son técnicamente válidas pero introducen pasos manuales adicionales.</w:t>
+        <w:t>Existen alternativas reales a Docker (Podman, containerd, LXC). La comparativa cuantitativa se presenta en la sección 5.4.1. Docker se mantiene como elección por su curva de aprendizaje menor para el equipo (C1: 3 días con tutoriales oficiales en español) y por su soporte directo en Render (despliegue desde Dockerfile sin configuración adicional). Las alternativas son técnicamente válidas pero introducen pasos manuales adicionales.</w:t>
       </w:r>
     </w:p>
     <w:p>
@@ -9480,42 +8720,6 @@
         </w:rPr>
         <w:t>Render gana en C1 (1 día, igual que Vercel) y en C5 (0 USD/año con PostgreSQL incluido, frente a Vercel que cobra el servicio de PostgreSQL aparte). En soporte para el stack del proyecto, Render tiene PostgreSQL administrado nativo, Vercel no. El servidor propio (VPS) tiene mejor C6 pero pierde decisivamente en C1 (14+ días vs 1 día) y C5 (~60 USD/año vs 0). La limitación conocida del plan gratuito de Render es el modo "sleep" después de 15 minutos de inactividad, que produce una primera petición lenta al despertar: para un sistema académico es aceptable y se documenta en el plan de riesgos del proyecto.</w:t>
       </w:r>
-      <w:proofErr w:type="spellStart"/>
-      <w:r>
-        <w:rPr>
-          <w:color w:val="000000"/>
-          <w:lang w:val="es-MX"/>
-        </w:rPr>
-      </w:r>
-      <w:proofErr w:type="spellEnd"/>
-      <w:r>
-        <w:rPr>
-          <w:color w:val="000000"/>
-          <w:lang w:val="es-MX"/>
-        </w:rPr>
-      </w:r>
-      <w:proofErr w:type="spellStart"/>
-      <w:r>
-        <w:rPr>
-          <w:color w:val="000000"/>
-          <w:lang w:val="es-MX"/>
-        </w:rPr>
-      </w:r>
-      <w:proofErr w:type="spellEnd"/>
-      <w:r>
-        <w:rPr>
-          <w:color w:val="000000"/>
-          <w:lang w:val="es-MX"/>
-        </w:rPr>
-      </w:r>
-      <w:proofErr w:type="spellStart"/>
-      <w:r>
-        <w:rPr>
-          <w:color w:val="000000"/>
-          <w:lang w:val="es-MX"/>
-        </w:rPr>
-      </w:r>
-      <w:proofErr w:type="spellEnd"/>
       <w:r>
         <w:rPr>
           <w:color w:val="000000"/>
@@ -9554,28 +8758,6 @@
         </w:rPr>
         <w:t>Existen alternativas reales a GitHub (GitLab, Bitbucket). La comparativa se presenta en la sección 5.5.1. GitHub se elige por su integración nativa con Render (despliegue automático al hacer push), su interfaz familiar para el equipo y su plan gratuito sin restricciones para proyectos públicos. Git como sistema de control de versiones no se evalúa porque Mercurial y SVN han perdido tracción al punto de no ser considerados en proyectos nuevos: Git es el estándar absoluto en la industria desde hace más de una década.</w:t>
       </w:r>
-      <w:proofErr w:type="spellStart"/>
-      <w:r>
-        <w:rPr>
-          <w:color w:val="000000"/>
-          <w:lang w:val="es-MX"/>
-        </w:rPr>
-      </w:r>
-      <w:proofErr w:type="spellEnd"/>
-      <w:r>
-        <w:rPr>
-          <w:color w:val="000000"/>
-          <w:lang w:val="es-MX"/>
-        </w:rPr>
-      </w:r>
-      <w:proofErr w:type="spellStart"/>
-      <w:r>
-        <w:rPr>
-          <w:color w:val="000000"/>
-          <w:lang w:val="es-MX"/>
-        </w:rPr>
-      </w:r>
-      <w:proofErr w:type="spellEnd"/>
       <w:r>
         <w:rPr>
           <w:color w:val="000000"/>
@@ -10522,7 +9704,7 @@
           <w:rFonts w:ascii="Arial" w:hAnsi="Arial"/>
           <w:sz w:val="22"/>
         </w:rPr>
-        <w:t>Las tecnologías evaluadas en este capítulo son alternativas técnicamente similares. Para todos los criterios decisivos del proyecto, las opciones consideradas (React, Vue y Angular en la capa de Vista; Node.js+Express, Python+Django y PHP+Laravel en la capa de Lógica; PostgreSQL, MySQL y Firebase en la capa de Datos; Render, Vercel y servidor propio en la capa de Despliegue; Docker, Podman y containerd en empaquetado; y GitHub, GitLab y Bitbucket en control de versiones) pueden construir SIGECOP. La diferencia entre ellas es marginal en cuanto a capacidad operativa (C6) o licenciamiento (C5), y se concentra principalmente en el criterio C1: la curva de aprendizaje. Por esa razón este estudio elige el stack que permite al equipo arrancar con la menor curva conocida. El costo más alto que enfrenta el proyecto no es el costo monetario ni el de capacidad, sino el costo de tiempo: nueve sprints de una semana, donde cada integrante aporta tres días útiles de trabajo efectivo (3 personas × 3 días × 1 punto/día = 9 puntos por sprint), no admite dedicar un mes completo al aprendizaje de un framework desconocido cuando existe una alternativa funcionalmente equivalente que el equipo puede usar en una semana.</w:t>
+        <w:t>Las tecnologías evaluadas en este capítulo son alternativas técnicamente similares. Para todos los criterios decisivos del proyecto, las opciones consideradas (React, Vue y Angular en la capa de Vista; Node.js+Express, Python+Django y PHP+Laravel en la capa de Lógica; PostgreSQL, MySQL y Firebase en la capa de Datos; Render, Vercel y servidor propio en la capa de Despliegue; Docker, Podman y containerd en empaquetado; y GitHub, GitLab y Bitbucket en control de versiones) pueden construir SIGECOP. La diferencia entre ellas es marginal en cuanto a capacidad operativa (C6) o licenciamiento (C5), y se concentra principalmente en el criterio C1: la curva de aprendizaje. Por esa razón este estudio elige el stack que permite al equipo arrancar con la menor curva conocida. El costo más alto que enfrenta el proyecto no es el costo monetario ni el de capacidad, sino el costo de tiempo: nueve sprints de tres días útiles, con tres integrantes, no admite dedicar un mes completo al aprendizaje de un framework desconocido cuando existe una alternativa funcionalmente equivalente que el equipo puede usar en una semana.</w:t>
       </w:r>
     </w:p>
     <w:p>
@@ -10562,23 +9744,7 @@
           <w:color w:val="000000"/>
           <w:lang w:val="es-MX"/>
         </w:rPr>
-        <w:t xml:space="preserve">La consolidación de las decisiones tomadas en la sección anterior produce el siguiente </w:t>
-      </w:r>
-      <w:proofErr w:type="spellStart"/>
-      <w:r>
-        <w:rPr>
-          <w:color w:val="000000"/>
-          <w:lang w:val="es-MX"/>
-        </w:rPr>
-        <w:t>stack</w:t>
-      </w:r>
-      <w:proofErr w:type="spellEnd"/>
-      <w:r>
-        <w:rPr>
-          <w:color w:val="000000"/>
-          <w:lang w:val="es-MX"/>
-        </w:rPr>
-        <w:t xml:space="preserve"> tecnológico definitivo para SIGECOP:</w:t>
+        <w:t>La consolidación de las decisiones tomadas en la sección anterior produce el siguiente stack tecnológico definitivo para SIGECOP:</w:t>
       </w:r>
     </w:p>
     <w:p>
@@ -10727,7 +9893,6 @@
             <w:pPr>
               <w:jc w:val="center"/>
             </w:pPr>
-            <w:proofErr w:type="spellStart"/>
             <w:r>
               <w:rPr>
                 <w:b/>
@@ -10736,18 +9901,7 @@
                 <w:sz w:val="20"/>
                 <w:szCs w:val="20"/>
               </w:rPr>
-              <w:t>Justificación</w:t>
-            </w:r>
-            <w:proofErr w:type="spellEnd"/>
-            <w:r>
-              <w:rPr>
-                <w:b/>
-                <w:bCs/>
-                <w:color w:val="FFFFFF"/>
-                <w:sz w:val="20"/>
-                <w:szCs w:val="20"/>
-              </w:rPr>
-              <w:t xml:space="preserve"> principal</w:t>
+              <w:t>Justificación principal</w:t>
             </w:r>
           </w:p>
         </w:tc>
@@ -10878,7 +10032,6 @@
             <w:vAlign w:val="center"/>
           </w:tcPr>
           <w:p>
-            <w:proofErr w:type="spellStart"/>
             <w:r>
               <w:rPr>
                 <w:b/>
@@ -10887,7 +10040,6 @@
               </w:rPr>
               <w:t>Lógica</w:t>
             </w:r>
-            <w:proofErr w:type="spellEnd"/>
           </w:p>
         </w:tc>
         <w:tc>
@@ -10969,20 +10121,6 @@
               </w:rPr>
               <w:t>C1 3–5 días: el equipo ya programa en JavaScript en la capa de Vista, lo que reduce a la mitad la curva total de aprendizaje del proyecto. C2 512 MB RAM (el más ligero del análisis). C5 0 USD/año. C7 REST nativo.</w:t>
             </w:r>
-            <w:proofErr w:type="spellStart"/>
-            <w:r>
-              <w:rPr>
-                <w:color w:val="000000"/>
-                <w:lang w:val="es-MX"/>
-              </w:rPr>
-            </w:r>
-            <w:proofErr w:type="spellEnd"/>
-            <w:r>
-              <w:rPr>
-                <w:color w:val="000000"/>
-                <w:lang w:val="es-MX"/>
-              </w:rPr>
-            </w:r>
           </w:p>
         </w:tc>
       </w:tr>
@@ -11112,7 +10250,6 @@
             <w:vAlign w:val="center"/>
           </w:tcPr>
           <w:p>
-            <w:proofErr w:type="spellStart"/>
             <w:r>
               <w:rPr>
                 <w:b/>
@@ -11121,7 +10258,6 @@
               </w:rPr>
               <w:t>Despliegue</w:t>
             </w:r>
-            <w:proofErr w:type="spellEnd"/>
           </w:p>
         </w:tc>
         <w:tc>
@@ -11231,18 +10367,8 @@
                 <w:bCs/>
                 <w:color w:val="000000"/>
               </w:rPr>
-              <w:t xml:space="preserve">Control de </w:t>
-            </w:r>
-            <w:proofErr w:type="spellStart"/>
-            <w:r>
-              <w:rPr>
-                <w:b/>
-                <w:bCs/>
-                <w:color w:val="000000"/>
-              </w:rPr>
-              <w:t>versiones</w:t>
-            </w:r>
-            <w:proofErr w:type="spellEnd"/>
+              <w:t>Control de versiones</w:t>
+            </w:r>
           </w:p>
         </w:tc>
         <w:tc>
@@ -11349,39 +10475,7 @@
           <w:color w:val="000000"/>
           <w:lang w:val="es-MX"/>
         </w:rPr>
-        <w:t xml:space="preserve">Una propiedad emergente de este </w:t>
-      </w:r>
-      <w:proofErr w:type="spellStart"/>
-      <w:r>
-        <w:rPr>
-          <w:color w:val="000000"/>
-          <w:lang w:val="es-MX"/>
-        </w:rPr>
-        <w:t>stack</w:t>
-      </w:r>
-      <w:proofErr w:type="spellEnd"/>
-      <w:r>
-        <w:rPr>
-          <w:color w:val="000000"/>
-          <w:lang w:val="es-MX"/>
-        </w:rPr>
-        <w:t xml:space="preserve"> es que las capas de Vista y Lógica comparten el lenguaje (JavaScript), lo cual reduce a la mitad el esfuerzo de aprendizaje del equipo. Las capas de Datos y Despliegue, aunque usan tecnologías distintas, se interactúan mediante interfaces estándar (SQL y línea de comandos) que no requieren memorizar </w:t>
-      </w:r>
-      <w:proofErr w:type="spellStart"/>
-      <w:r>
-        <w:rPr>
-          <w:color w:val="000000"/>
-          <w:lang w:val="es-MX"/>
-        </w:rPr>
-        <w:t>APIs</w:t>
-      </w:r>
-      <w:proofErr w:type="spellEnd"/>
-      <w:r>
-        <w:rPr>
-          <w:color w:val="000000"/>
-          <w:lang w:val="es-MX"/>
-        </w:rPr>
-        <w:t xml:space="preserve"> complejas.</w:t>
+        <w:t>Una propiedad emergente de este stack es que las capas de Vista y Lógica comparten el lenguaje (JavaScript), lo cual reduce a la mitad el esfuerzo de aprendizaje del equipo. Las capas de Datos y Despliegue, aunque usan tecnologías distintas, se interactúan mediante interfaces estándar (SQL y línea de comandos) que no requieren memorizar APIs complejas.</w:t>
       </w:r>
     </w:p>
     <w:p>
@@ -11404,21 +10498,7 @@
           <w:color w:val="000000"/>
           <w:lang w:val="es-MX"/>
         </w:rPr>
-        <w:t>El stack completo es 100% gratuito, 100% código abierto y ejecutable en Linux, macOS y Windows mediante Docker. No introduce dependencias de proveedores propietarios que puedan generar costos imprevistos o limitaciones en etapas posteriores del proyecto.</w:t>
-      </w:r>
-      <w:proofErr w:type="spellStart"/>
-      <w:r>
-        <w:rPr>
-          <w:color w:val="000000"/>
-          <w:lang w:val="es-MX"/>
-        </w:rPr>
-      </w:r>
-      <w:proofErr w:type="spellEnd"/>
-      <w:r>
-        <w:rPr>
-          <w:color w:val="000000"/>
-          <w:lang w:val="es-MX"/>
-        </w:rPr>
+        <w:t>El stack completo es 100% gratuito, 100% código abierto y 100% portable entre sistemas operativos. No introduce dependencias de proveedores propietarios que puedan generar costos imprevistos o limitaciones en etapas posteriores del proyecto.</w:t>
       </w:r>
     </w:p>
     <w:p>
@@ -11459,21 +10539,7 @@
         <w:rPr>
           <w:lang w:val="es-MX"/>
         </w:rPr>
-        <w:t xml:space="preserve">El plan completo de gestión de riesgos del proyecto se documenta en un archivo independiente (Plan_Riesgos.xlsx), que se mantiene como documento vivo y se actualiza en cada sprint </w:t>
-      </w:r>
-      <w:proofErr w:type="spellStart"/>
-      <w:r>
-        <w:rPr>
-          <w:lang w:val="es-MX"/>
-        </w:rPr>
-        <w:t>planning</w:t>
-      </w:r>
-      <w:proofErr w:type="spellEnd"/>
-      <w:r>
-        <w:rPr>
-          <w:lang w:val="es-MX"/>
-        </w:rPr>
-        <w:t>. Dicho archivo contiene 12 riesgos identificados (técnicos, de equipo, de alcance, legales y de entrega), su evaluación de probabilidad e impacto, las estrategias de mitigación con dueño asignado, la bitácora de seguimiento histórico y la matriz de afectación riesgo-servicio.</w:t>
+        <w:t>El plan completo de gestión de riesgos del proyecto se documenta en un archivo independiente (Plan_Riesgos.xlsx), que se mantiene como documento vivo y se actualiza semanalmente. Dicho archivo contiene 12 riesgos identificados (técnicos, de equipo, de alcance, legales y de entrega), su evaluación de probabilidad e impacto, las estrategias de mitigación con dueño asignado, la bitácora de seguimiento histórico, el seguimiento semanal de la evolución de cada riesgo y la matriz de afectación riesgo-servicio.</w:t>
       </w:r>
     </w:p>
     <w:p>
@@ -11516,21 +10582,7 @@
           <w:color w:val="000000"/>
           <w:lang w:val="es-MX"/>
         </w:rPr>
-        <w:t>El proyecto SIGECOP es técnicamente factible bajo el stack propuesto. Las cuatro capas técnicas del sistema (Vista, Lógica, Datos y Despliegue), junto con el sistema de control de versiones, cuentan con tecnologías maduras, gratuitas, con comunidades activas y compatibles entre sí. Las decisiones tomadas en cada capa se justifican exclusivamente con criterios técnicos del proyecto, lo que permite defenderlas frente a cualquier cuestionamiento académico.</w:t>
-      </w:r>
-      <w:proofErr w:type="spellStart"/>
-      <w:r>
-        <w:rPr>
-          <w:color w:val="000000"/>
-          <w:lang w:val="es-MX"/>
-        </w:rPr>
-      </w:r>
-      <w:proofErr w:type="spellEnd"/>
-      <w:r>
-        <w:rPr>
-          <w:color w:val="000000"/>
-          <w:lang w:val="es-MX"/>
-        </w:rPr>
+        <w:t>El proyecto SIGECOP es técnicamente factible bajo el stack propuesto. Las cinco capas del sistema (Vista, Lógica, Datos, Despliegue y Control de Versiones) cuentan con tecnologías maduras, gratuitas, con comunidades activas y compatibles entre sí. Las decisiones tomadas en cada capa se justifican exclusivamente con criterios técnicos del proyecto, lo que permite defenderlas frente a cualquier cuestionamiento académico.</w:t>
       </w:r>
     </w:p>
     <w:p>
@@ -11546,23 +10598,7 @@
           <w:color w:val="000000"/>
           <w:lang w:val="es-MX"/>
         </w:rPr>
-        <w:t xml:space="preserve">Las propiedades emergentes del </w:t>
-      </w:r>
-      <w:proofErr w:type="spellStart"/>
-      <w:r>
-        <w:rPr>
-          <w:color w:val="000000"/>
-          <w:lang w:val="es-MX"/>
-        </w:rPr>
-        <w:t>stack</w:t>
-      </w:r>
-      <w:proofErr w:type="spellEnd"/>
-      <w:r>
-        <w:rPr>
-          <w:color w:val="000000"/>
-          <w:lang w:val="es-MX"/>
-        </w:rPr>
-        <w:t xml:space="preserve"> consolidado son favorables al proyecto:</w:t>
+        <w:t>Las propiedades emergentes del stack consolidado son favorables al proyecto:</w:t>
       </w:r>
     </w:p>
     <w:p>
@@ -11582,39 +10618,7 @@
           <w:color w:val="000000"/>
           <w:lang w:val="es-MX"/>
         </w:rPr>
-        <w:t xml:space="preserve">El equipo usa un único lenguaje principal (JavaScript) tanto en </w:t>
-      </w:r>
-      <w:proofErr w:type="spellStart"/>
-      <w:r>
-        <w:rPr>
-          <w:color w:val="000000"/>
-          <w:lang w:val="es-MX"/>
-        </w:rPr>
-        <w:t>frontend</w:t>
-      </w:r>
-      <w:proofErr w:type="spellEnd"/>
-      <w:r>
-        <w:rPr>
-          <w:color w:val="000000"/>
-          <w:lang w:val="es-MX"/>
-        </w:rPr>
-        <w:t xml:space="preserve"> como en </w:t>
-      </w:r>
-      <w:proofErr w:type="spellStart"/>
-      <w:r>
-        <w:rPr>
-          <w:color w:val="000000"/>
-          <w:lang w:val="es-MX"/>
-        </w:rPr>
-        <w:t>backend</w:t>
-      </w:r>
-      <w:proofErr w:type="spellEnd"/>
-      <w:r>
-        <w:rPr>
-          <w:color w:val="000000"/>
-          <w:lang w:val="es-MX"/>
-        </w:rPr>
-        <w:t>, lo que reduce a la mitad el esfuerzo de aprendizaje y simplifica el cambio de contexto entre tareas.</w:t>
+        <w:t>El equipo usa un único lenguaje principal (JavaScript) tanto en frontend como en backend, lo que reduce a la mitad el esfuerzo de aprendizaje y simplifica el cambio de contexto entre tareas.</w:t>
       </w:r>
     </w:p>
     <w:p>

</xml_diff>